<commit_message>
Fix DPD/Kuenhne/Delivengo billing logic ; ignore video files
</commit_message>
<xml_diff>
--- a/Documentation/Notes.docx
+++ b/Documentation/Notes.docx
@@ -5,39 +5,50 @@
     <w:p>
       <w:pPr>
         <w:jc w:val="center"/>
-      </w:pPr>
-      <w:r>
+        <w:rPr>
+          <w:color w:val="EE0000"/>
+          <w:sz w:val="96"/>
+          <w:szCs w:val="96"/>
+        </w:rPr>
+      </w:pPr>
+      <w:r>
+        <w:rPr>
+          <w:color w:val="EE0000"/>
+          <w:sz w:val="96"/>
+          <w:szCs w:val="96"/>
+        </w:rPr>
         <w:t>Facturation :</w:t>
       </w:r>
     </w:p>
     <w:p>
+      <w:pPr>
+        <w:jc w:val="center"/>
+        <w:rPr>
+          <w:color w:val="EE0000"/>
+          <w:sz w:val="16"/>
+          <w:szCs w:val="16"/>
+        </w:rPr>
+      </w:pPr>
+    </w:p>
+    <w:p>
       <w:r>
         <w:t xml:space="preserve">Faire entrer les taxe gasoil avant dans le </w:t>
       </w:r>
-      <w:proofErr w:type="gramStart"/>
-      <w:r>
-        <w:t>erp ,</w:t>
-      </w:r>
-      <w:proofErr w:type="gramEnd"/>
+      <w:r>
+        <w:t>ERP,</w:t>
+      </w:r>
       <w:r>
         <w:t xml:space="preserve"> et c’est par </w:t>
       </w:r>
-      <w:proofErr w:type="gramStart"/>
-      <w:r>
-        <w:t xml:space="preserve">transporteur </w:t>
-      </w:r>
-      <w:r>
-        <w:t>,</w:t>
-      </w:r>
-      <w:proofErr w:type="gramEnd"/>
+      <w:r>
+        <w:t>transporteur,</w:t>
+      </w:r>
       <w:r>
         <w:t xml:space="preserve"> y a ceux qui l’ont et ceux </w:t>
       </w:r>
-      <w:proofErr w:type="gramStart"/>
-      <w:r>
-        <w:t>qui l’ont pas</w:t>
-      </w:r>
-      <w:proofErr w:type="gramEnd"/>
+      <w:r>
+        <w:t>qui ne l’ont pas</w:t>
+      </w:r>
       <w:r>
         <w:t xml:space="preserve"> </w:t>
       </w:r>
@@ -49,13 +60,17 @@
     </w:p>
     <w:p>
       <w:r>
-        <w:t xml:space="preserve">Avarie d’imports = tracking pas trouvés dans le erp </w:t>
-      </w:r>
-      <w:proofErr w:type="gramStart"/>
-      <w:r>
-        <w:t>( appel</w:t>
-      </w:r>
-      <w:proofErr w:type="gramEnd"/>
+        <w:t xml:space="preserve">Avarie d’imports = tracking pas trouvés dans le </w:t>
+      </w:r>
+      <w:r>
+        <w:t>ERP</w:t>
+      </w:r>
+      <w:r>
+        <w:t xml:space="preserve"> </w:t>
+      </w:r>
+      <w:r>
+        <w:t>(appel</w:t>
+      </w:r>
       <w:r>
         <w:t xml:space="preserve"> en api du transport / expé pas partis de chez nous /</w:t>
       </w:r>
@@ -64,11 +79,9 @@
       <w:r>
         <w:t>Avarie de vente = grille tarifaires pourris</w:t>
       </w:r>
-      <w:proofErr w:type="gramStart"/>
-      <w:r>
-        <w:t xml:space="preserve"> ….</w:t>
-      </w:r>
-      <w:proofErr w:type="gramEnd"/>
+      <w:r>
+        <w:t xml:space="preserve"> …</w:t>
+      </w:r>
       <w:r>
         <w:t>.</w:t>
       </w:r>
@@ -76,32 +89,32 @@
     <w:p/>
     <w:p>
       <w:r>
-        <w:t>Viticolis = principalement ups ou</w:t>
+        <w:t xml:space="preserve">Viticolis = principalement </w:t>
+      </w:r>
+      <w:r>
+        <w:t>UPS</w:t>
+      </w:r>
+      <w:r>
+        <w:t xml:space="preserve"> ou</w:t>
       </w:r>
       <w:r>
         <w:t xml:space="preserve"> </w:t>
       </w:r>
-      <w:proofErr w:type="gramStart"/>
-      <w:r>
-        <w:t>( geodis</w:t>
-      </w:r>
-      <w:proofErr w:type="gramEnd"/>
-      <w:r>
-        <w:t xml:space="preserve"> , </w:t>
-      </w:r>
-      <w:proofErr w:type="gramStart"/>
-      <w:r>
-        <w:t>kuehne ,</w:t>
-      </w:r>
-      <w:proofErr w:type="gramEnd"/>
+      <w:r>
+        <w:t>(</w:t>
+      </w:r>
+      <w:r>
+        <w:t>Geodis,</w:t>
+      </w:r>
       <w:r>
         <w:t xml:space="preserve"> </w:t>
       </w:r>
-      <w:proofErr w:type="gramStart"/>
-      <w:r>
-        <w:t>bls )</w:t>
-      </w:r>
-      <w:proofErr w:type="gramEnd"/>
+      <w:r>
+        <w:t>Kuehne,</w:t>
+      </w:r>
+      <w:r>
+        <w:t xml:space="preserve"> bls)</w:t>
+      </w:r>
     </w:p>
     <w:p>
       <w:r>
@@ -128,11 +141,9 @@
       <w:r>
         <w:t xml:space="preserve">jours </w:t>
       </w:r>
-      <w:proofErr w:type="gramStart"/>
-      <w:r>
-        <w:t>au transporteurs</w:t>
-      </w:r>
-      <w:proofErr w:type="gramEnd"/>
+      <w:r>
+        <w:t>au transporteur</w:t>
+      </w:r>
       <w:r>
         <w:t xml:space="preserve"> : </w:t>
       </w:r>
@@ -150,55 +161,459 @@
     </w:p>
     <w:p>
       <w:r>
-        <w:t xml:space="preserve">Navette = </w:t>
-      </w:r>
-      <w:proofErr w:type="gramStart"/>
-      <w:r>
-        <w:t>tarifs négocié</w:t>
-      </w:r>
-      <w:proofErr w:type="gramEnd"/>
+        <w:t xml:space="preserve">Navette = tarifs </w:t>
+      </w:r>
+      <w:r>
+        <w:t>négociés</w:t>
+      </w:r>
       <w:r>
         <w:t xml:space="preserve"> avec le </w:t>
       </w:r>
-      <w:proofErr w:type="gramStart"/>
-      <w:r>
-        <w:t>transporteurs ,</w:t>
-      </w:r>
-      <w:proofErr w:type="gramEnd"/>
-      <w:r>
-        <w:t xml:space="preserve"> factures internes : kuehne (inclus dans le </w:t>
-      </w:r>
-      <w:proofErr w:type="gramStart"/>
-      <w:r>
-        <w:t>excel)  et</w:t>
-      </w:r>
-      <w:proofErr w:type="gramEnd"/>
-      <w:r>
-        <w:t xml:space="preserve"> geodis </w:t>
-      </w:r>
-      <w:proofErr w:type="gramStart"/>
-      <w:r>
-        <w:t>( pdf</w:t>
-      </w:r>
-      <w:proofErr w:type="gramEnd"/>
+      <w:r>
+        <w:t>transporteur,</w:t>
+      </w:r>
+      <w:r>
+        <w:t xml:space="preserve"> factures internes : </w:t>
+      </w:r>
+      <w:r>
+        <w:t>Kuehne</w:t>
+      </w:r>
+      <w:r>
+        <w:t xml:space="preserve"> (inclus dans le </w:t>
+      </w:r>
+      <w:r>
+        <w:t>Excel) et</w:t>
+      </w:r>
       <w:r>
         <w:t xml:space="preserve"> </w:t>
       </w:r>
-      <w:proofErr w:type="gramStart"/>
-      <w:r>
-        <w:t>ailleurs )</w:t>
-      </w:r>
-      <w:proofErr w:type="gramEnd"/>
-      <w:r>
-        <w:t xml:space="preserve">  et bls (pas encore commencé avec eux) </w:t>
-      </w:r>
-    </w:p>
-    <w:p>
-      <w:r>
-        <w:t xml:space="preserve">Tva : France/europe = 0.2 et ailleurs = 0.0 </w:t>
+      <w:r>
+        <w:t>Geodis</w:t>
+      </w:r>
+      <w:r>
+        <w:t xml:space="preserve"> (</w:t>
+      </w:r>
+      <w:r>
+        <w:t>PDF</w:t>
+      </w:r>
+      <w:r>
+        <w:t xml:space="preserve"> </w:t>
+      </w:r>
+      <w:r>
+        <w:t>ailleurs)</w:t>
+      </w:r>
+      <w:r>
+        <w:t xml:space="preserve"> et </w:t>
+      </w:r>
+      <w:r>
+        <w:t>BLS</w:t>
+      </w:r>
+      <w:r>
+        <w:t xml:space="preserve"> (pas encore commencé avec eux) </w:t>
+      </w:r>
+    </w:p>
+    <w:p>
+      <w:r>
+        <w:t>Tva : France/</w:t>
+      </w:r>
+      <w:r>
+        <w:t>E</w:t>
+      </w:r>
+      <w:r>
+        <w:t xml:space="preserve">urope = 0.2 et ailleurs = 0.0 </w:t>
       </w:r>
       <w:r>
         <w:t>*</w:t>
+      </w:r>
+    </w:p>
+    <w:p>
+      <w:pPr>
+        <w:rPr>
+          <w:color w:val="7030A0"/>
+          <w:u w:val="single"/>
+        </w:rPr>
+      </w:pPr>
+      <w:r>
+        <w:rPr>
+          <w:color w:val="7030A0"/>
+          <w:u w:val="single"/>
+        </w:rPr>
+        <w:t xml:space="preserve">Des remarques qui sont après V1 du Dashboard : </w:t>
+      </w:r>
+    </w:p>
+    <w:p>
+      <w:pPr>
+        <w:pStyle w:val="Paragraphedeliste"/>
+        <w:numPr>
+          <w:ilvl w:val="0"/>
+          <w:numId w:val="5"/>
+        </w:numPr>
+        <w:rPr>
+          <w:u w:val="single"/>
+        </w:rPr>
+      </w:pPr>
+      <w:r>
+        <w:t xml:space="preserve">Dans le fichier facture (le classeur) laisser les formules des cellules dans toutes les feuilles du classeur </w:t>
+      </w:r>
+      <w:r>
+        <w:rPr>
+          <w:color w:val="C00000"/>
+        </w:rPr>
+        <w:t xml:space="preserve">= ça marche que pour le mois 06 mais j’ai essayé avec les fichiers du transporteur KUEHNE </w:t>
+      </w:r>
+      <w:r>
+        <w:rPr>
+          <w:color w:val="C00000"/>
+        </w:rPr>
+        <w:t>du mois 05 ça renvoie un fichier pas le même que celui du mois de 06</w:t>
+      </w:r>
+    </w:p>
+    <w:p>
+      <w:pPr>
+        <w:pStyle w:val="Paragraphedeliste"/>
+        <w:numPr>
+          <w:ilvl w:val="0"/>
+          <w:numId w:val="5"/>
+        </w:numPr>
+        <w:rPr>
+          <w:u w:val="single"/>
+        </w:rPr>
+      </w:pPr>
+    </w:p>
+    <w:p/>
+    <w:p>
+      <w:r>
+        <w:t>**</w:t>
+      </w:r>
+      <w:r>
+        <w:t xml:space="preserve">Delivengo = fret =1.0 </w:t>
+      </w:r>
+      <w:r>
+        <w:t>on ne facture rien</w:t>
+      </w:r>
+      <w:r>
+        <w:t xml:space="preserve"> (à voir) </w:t>
+      </w:r>
+      <w:r>
+        <w:t>fini, attendu export expé brut</w:t>
+      </w:r>
+      <w:r>
+        <w:t xml:space="preserve"> </w:t>
+      </w:r>
+    </w:p>
+    <w:p>
+      <w:pPr>
+        <w:rPr>
+          <w:color w:val="7030A0"/>
+          <w:u w:val="single"/>
+        </w:rPr>
+      </w:pPr>
+      <w:r>
+        <w:rPr>
+          <w:color w:val="7030A0"/>
+          <w:u w:val="single"/>
+        </w:rPr>
+        <w:t xml:space="preserve">Des remarques qui sont après V1 du Dashboard : </w:t>
+      </w:r>
+    </w:p>
+    <w:p>
+      <w:pPr>
+        <w:pStyle w:val="Paragraphedeliste"/>
+        <w:numPr>
+          <w:ilvl w:val="0"/>
+          <w:numId w:val="2"/>
+        </w:numPr>
+      </w:pPr>
+      <w:r>
+        <w:t xml:space="preserve">Normalement le fichier _Import, la colonne Poids du fichier brut Delivengo et prendre la colonne poids/100 et la mettre dans la colonne poids et assurances du fichier d’import qu’on crée </w:t>
+      </w:r>
+    </w:p>
+    <w:p>
+      <w:pPr>
+        <w:pStyle w:val="Paragraphedeliste"/>
+        <w:numPr>
+          <w:ilvl w:val="0"/>
+          <w:numId w:val="2"/>
+        </w:numPr>
+      </w:pPr>
+      <w:r>
+        <w:t>Pour colonne droits et taxe du fichier d’import faut chercher le numéro suivi dans le fichier des exports bruts du mois en cours (colonne PRO_TRACKING)</w:t>
+      </w:r>
+      <w:r>
+        <w:t xml:space="preserve"> pour ressortir la </w:t>
+      </w:r>
+      <w:r>
+        <w:lastRenderedPageBreak/>
+        <w:t>colonne INFO_POIDS</w:t>
+      </w:r>
+      <w:r>
+        <w:t xml:space="preserve">, donc dans le logiciel faut mentionner où mettre le fichier du transporteur qu’on reçoit + le fichier des exports bruts du mois en cours </w:t>
+      </w:r>
+    </w:p>
+    <w:p>
+      <w:pPr>
+        <w:pStyle w:val="Paragraphedeliste"/>
+        <w:numPr>
+          <w:ilvl w:val="0"/>
+          <w:numId w:val="2"/>
+        </w:numPr>
+      </w:pPr>
+      <w:r>
+        <w:t xml:space="preserve">Et si après cette manipulation on aperçoit des colonnes droits et taxes qui sont vide, faut faire la même recherche par numéro de suivi dans le fichier des export bruts du mois précèdent </w:t>
+      </w:r>
+    </w:p>
+    <w:p>
+      <w:r>
+        <w:t>**</w:t>
+      </w:r>
+      <w:r>
+        <w:t xml:space="preserve">Geodis = </w:t>
+      </w:r>
+      <w:r>
+        <w:t>colonnes décalées</w:t>
+      </w:r>
+      <w:r>
+        <w:t xml:space="preserve"> vers la </w:t>
+      </w:r>
+      <w:r>
+        <w:t>fin,</w:t>
+      </w:r>
+      <w:r>
+        <w:t xml:space="preserve"> toujours </w:t>
+      </w:r>
+      <w:r>
+        <w:t>vérifier</w:t>
+      </w:r>
+      <w:r>
+        <w:t> </w:t>
+      </w:r>
+      <w:r>
+        <w:t>!!,</w:t>
+      </w:r>
+      <w:r>
+        <w:t xml:space="preserve"> a verifier que cette colonne est dans la formule du </w:t>
+      </w:r>
+      <w:r>
+        <w:t>fret,</w:t>
+      </w:r>
+      <w:r>
+        <w:t xml:space="preserve"> </w:t>
+      </w:r>
+      <w:r>
+        <w:t>numéro</w:t>
+      </w:r>
+      <w:r>
+        <w:t xml:space="preserve"> </w:t>
+      </w:r>
+      <w:r>
+        <w:t>récépissé</w:t>
+      </w:r>
+      <w:r>
+        <w:t xml:space="preserve"> = 9 : messagerie e</w:t>
+      </w:r>
+      <w:r>
+        <w:t>t</w:t>
+      </w:r>
+      <w:r>
+        <w:t xml:space="preserve"> 4 : </w:t>
+      </w:r>
+      <w:r>
+        <w:t>affrètement</w:t>
+      </w:r>
+      <w:r>
+        <w:t xml:space="preserve"> </w:t>
+      </w:r>
+    </w:p>
+    <w:p>
+      <w:r>
+        <w:t xml:space="preserve">**BLS est fait </w:t>
+      </w:r>
+    </w:p>
+    <w:p>
+      <w:r>
+        <w:t xml:space="preserve">**GLS : même </w:t>
+      </w:r>
+      <w:r>
+        <w:t>procédure,</w:t>
+      </w:r>
+      <w:r>
+        <w:t xml:space="preserve"> on recopie le fichier du mois </w:t>
+      </w:r>
+      <w:r>
+        <w:t>précèdent,</w:t>
+      </w:r>
+      <w:r>
+        <w:t xml:space="preserve"> on colle le fichier csv en valeur, tableau en bas = base du </w:t>
+      </w:r>
+      <w:r>
+        <w:t>TCD</w:t>
+      </w:r>
+      <w:r>
+        <w:t xml:space="preserve">, actualiser la feuille poids, effacer les id </w:t>
+      </w:r>
+      <w:r>
+        <w:t>clients,</w:t>
+      </w:r>
+      <w:r>
+        <w:t xml:space="preserve"> bilan facture = on compare avec le </w:t>
+      </w:r>
+      <w:r>
+        <w:t>PDF,</w:t>
+      </w:r>
+      <w:r>
+        <w:t xml:space="preserve"> </w:t>
+      </w:r>
+      <w:r>
+        <w:t>vérification</w:t>
+      </w:r>
+      <w:r>
+        <w:t xml:space="preserve"> </w:t>
+      </w:r>
+      <w:r>
+        <w:t>des frets</w:t>
+      </w:r>
+      <w:r>
+        <w:t xml:space="preserve"> à </w:t>
+      </w:r>
+      <w:r>
+        <w:t>zéro,</w:t>
+      </w:r>
+      <w:r>
+        <w:t xml:space="preserve"> taxe </w:t>
+      </w:r>
+      <w:r>
+        <w:t>gazole</w:t>
+      </w:r>
+      <w:r>
+        <w:t xml:space="preserve"> à rajouter sur </w:t>
+      </w:r>
+      <w:r>
+        <w:t>l’ERP</w:t>
+      </w:r>
+      <w:r>
+        <w:t xml:space="preserve"> </w:t>
+      </w:r>
+    </w:p>
+    <w:p/>
+    <w:p>
+      <w:r>
+        <w:t>** Lettres : filtre sur les exp</w:t>
+      </w:r>
+      <w:r>
+        <w:t>és</w:t>
+      </w:r>
+      <w:r>
+        <w:t xml:space="preserve"> bruts, vider tous les</w:t>
+      </w:r>
+      <w:r>
+        <w:t xml:space="preserve"> </w:t>
+      </w:r>
+      <w:r>
+        <w:t xml:space="preserve">tracking vide colonne </w:t>
+      </w:r>
+      <w:r>
+        <w:t>bleue</w:t>
+      </w:r>
+      <w:r>
+        <w:t xml:space="preserve">, et les rechercher dans un export depuis </w:t>
+      </w:r>
+      <w:r>
+        <w:t>l’ERP,</w:t>
+      </w:r>
+      <w:r>
+        <w:t xml:space="preserve"> et ceux dont y a un </w:t>
+      </w:r>
+      <w:r>
+        <w:t>zéro</w:t>
+      </w:r>
+      <w:r>
+        <w:t xml:space="preserve">, on </w:t>
+      </w:r>
+      <w:r>
+        <w:t>met</w:t>
+      </w:r>
+      <w:r>
+        <w:t xml:space="preserve"> </w:t>
+      </w:r>
+      <w:r>
+        <w:t>numéro</w:t>
+      </w:r>
+      <w:r>
+        <w:t xml:space="preserve"> de tracking = </w:t>
+      </w:r>
+      <w:r>
+        <w:t>numéro</w:t>
+      </w:r>
+      <w:r>
+        <w:t xml:space="preserve"> d’</w:t>
+      </w:r>
+      <w:r>
+        <w:t>expéditions</w:t>
+      </w:r>
+      <w:r>
+        <w:t xml:space="preserve"> et en le mets en </w:t>
+      </w:r>
+      <w:r>
+        <w:t>couleur</w:t>
+      </w:r>
+      <w:r>
+        <w:t xml:space="preserve"> bleu foncé et on </w:t>
+      </w:r>
+      <w:r>
+        <w:t>met</w:t>
+      </w:r>
+      <w:r>
+        <w:t xml:space="preserve"> à jour dans </w:t>
+      </w:r>
+      <w:r>
+        <w:t>l’ERP</w:t>
+      </w:r>
+      <w:r>
+        <w:t xml:space="preserve"> le </w:t>
+      </w:r>
+      <w:r>
+        <w:t>numéro</w:t>
+      </w:r>
+      <w:r>
+        <w:t xml:space="preserve"> de tracking (sauf expe en cours de </w:t>
+      </w:r>
+      <w:r>
+        <w:t>préparation</w:t>
+      </w:r>
+      <w:r>
+        <w:t xml:space="preserve"> à ne pas facturer et les bien </w:t>
+      </w:r>
+      <w:r>
+        <w:t>vérifier)</w:t>
+      </w:r>
+    </w:p>
+    <w:p>
+      <w:r>
+        <w:t>Le pro_tracking = BAC25</w:t>
+      </w:r>
+      <w:r>
+        <w:t>*,</w:t>
+      </w:r>
+      <w:r>
+        <w:t xml:space="preserve"> faute dans l’atelier, mettre </w:t>
+      </w:r>
+      <w:r>
+        <w:t>numéro</w:t>
+      </w:r>
+      <w:r>
+        <w:t xml:space="preserve"> d’</w:t>
+      </w:r>
+      <w:r>
+        <w:t>expédition</w:t>
+      </w:r>
+      <w:r>
+        <w:t xml:space="preserve"> en tracking </w:t>
+      </w:r>
+    </w:p>
+    <w:p/>
+    <w:p>
+      <w:r>
+        <w:t xml:space="preserve"> </w:t>
       </w:r>
     </w:p>
     <w:p>
@@ -209,656 +624,111 @@
         <w:t>**</w:t>
       </w:r>
       <w:r>
-        <w:rPr>
-          <w:highlight w:val="yellow"/>
-        </w:rPr>
-        <w:t>Delivengo</w:t>
-      </w:r>
-      <w:r>
-        <w:t xml:space="preserve"> = fret =1.0 </w:t>
-      </w:r>
-      <w:proofErr w:type="gramStart"/>
-      <w:r>
-        <w:t>on facture rie</w:t>
-      </w:r>
-      <w:r>
-        <w:t>n</w:t>
-      </w:r>
-      <w:proofErr w:type="gramEnd"/>
-      <w:r>
-        <w:t xml:space="preserve"> (à voir) </w:t>
-      </w:r>
-      <w:proofErr w:type="gramStart"/>
-      <w:r>
-        <w:t>fini ,</w:t>
-      </w:r>
-      <w:proofErr w:type="gramEnd"/>
-      <w:r>
-        <w:t xml:space="preserve"> attendu export expé brut </w:t>
-      </w:r>
-    </w:p>
-    <w:p/>
-    <w:p>
-      <w:r>
-        <w:t>**</w:t>
-      </w:r>
-      <w:r>
-        <w:t xml:space="preserve">Geodis = colonnes decalé vers la </w:t>
-      </w:r>
-      <w:proofErr w:type="gramStart"/>
-      <w:r>
-        <w:t>fin ,</w:t>
-      </w:r>
-      <w:proofErr w:type="gramEnd"/>
-      <w:r>
-        <w:t xml:space="preserve"> toujours verifier </w:t>
-      </w:r>
-      <w:proofErr w:type="gramStart"/>
-      <w:r>
-        <w:t>!! ,</w:t>
-      </w:r>
-      <w:proofErr w:type="gramEnd"/>
-      <w:r>
-        <w:t xml:space="preserve"> a verifier que cette colonne est dans la formule du </w:t>
-      </w:r>
-      <w:proofErr w:type="gramStart"/>
-      <w:r>
-        <w:t xml:space="preserve">fret </w:t>
-      </w:r>
-      <w:r>
-        <w:t>,</w:t>
-      </w:r>
-      <w:proofErr w:type="gramEnd"/>
-      <w:r>
-        <w:t xml:space="preserve"> numero recepisse = 9 : messagerie e</w:t>
-      </w:r>
-      <w:r>
-        <w:t>t</w:t>
-      </w:r>
-      <w:r>
-        <w:t xml:space="preserve"> 4 : </w:t>
-      </w:r>
-      <w:proofErr w:type="spellStart"/>
-      <w:r>
-        <w:t>affretement</w:t>
-      </w:r>
-      <w:proofErr w:type="spellEnd"/>
+        <w:t>UP</w:t>
+      </w:r>
+      <w:r>
+        <w:t>S</w:t>
+      </w:r>
+      <w:r>
+        <w:t xml:space="preserve">, enlever multitaskeur et vitawave : </w:t>
+      </w:r>
+      <w:r>
+        <w:t>télécharger</w:t>
+      </w:r>
+      <w:r>
+        <w:t xml:space="preserve"> les factures par paquet de 10 sur le site du transporteur  </w:t>
+      </w:r>
+    </w:p>
+    <w:p>
+      <w:r>
+        <w:t xml:space="preserve">Remplacer point par virgule dans </w:t>
+      </w:r>
+      <w:r>
+        <w:t>toutes les colonnes</w:t>
+      </w:r>
       <w:r>
         <w:t xml:space="preserve"> </w:t>
       </w:r>
-    </w:p>
-    <w:p>
-      <w:r>
-        <w:t xml:space="preserve">**BLS est fait </w:t>
-      </w:r>
-    </w:p>
-    <w:p>
-      <w:r>
-        <w:t xml:space="preserve">**GLS : même </w:t>
-      </w:r>
-      <w:proofErr w:type="spellStart"/>
-      <w:proofErr w:type="gramStart"/>
-      <w:r>
-        <w:t>proceedure</w:t>
-      </w:r>
-      <w:proofErr w:type="spellEnd"/>
-      <w:r>
-        <w:t xml:space="preserve"> ,</w:t>
-      </w:r>
-      <w:proofErr w:type="gramEnd"/>
-      <w:r>
-        <w:t xml:space="preserve"> on recopie le fichier du mois </w:t>
-      </w:r>
-      <w:proofErr w:type="spellStart"/>
-      <w:proofErr w:type="gramStart"/>
-      <w:r>
-        <w:t>precedent</w:t>
-      </w:r>
-      <w:proofErr w:type="spellEnd"/>
-      <w:r>
-        <w:t xml:space="preserve"> ,</w:t>
-      </w:r>
-      <w:proofErr w:type="gramEnd"/>
-      <w:r>
-        <w:t xml:space="preserve"> on colle le fichier csv en </w:t>
-      </w:r>
-      <w:proofErr w:type="gramStart"/>
-      <w:r>
-        <w:t>valeur ,</w:t>
-      </w:r>
-      <w:proofErr w:type="gramEnd"/>
-      <w:r>
-        <w:t xml:space="preserve"> tableau en bas = base du </w:t>
-      </w:r>
-      <w:proofErr w:type="spellStart"/>
-      <w:proofErr w:type="gramStart"/>
-      <w:r>
-        <w:t>tcd</w:t>
-      </w:r>
-      <w:proofErr w:type="spellEnd"/>
-      <w:r>
-        <w:t xml:space="preserve"> ,</w:t>
-      </w:r>
-      <w:proofErr w:type="gramEnd"/>
-      <w:r>
-        <w:t xml:space="preserve"> actualiser la feuille </w:t>
-      </w:r>
-      <w:proofErr w:type="gramStart"/>
-      <w:r>
-        <w:t>poids ,</w:t>
-      </w:r>
-      <w:proofErr w:type="gramEnd"/>
-      <w:r>
-        <w:t xml:space="preserve"> effacer les id </w:t>
-      </w:r>
-      <w:proofErr w:type="gramStart"/>
-      <w:r>
-        <w:t>clients ,</w:t>
-      </w:r>
-      <w:proofErr w:type="gramEnd"/>
-      <w:r>
-        <w:t xml:space="preserve"> bilan facture = on compare avec le </w:t>
-      </w:r>
-      <w:proofErr w:type="spellStart"/>
-      <w:proofErr w:type="gramStart"/>
-      <w:r>
-        <w:t>pdf</w:t>
-      </w:r>
-      <w:proofErr w:type="spellEnd"/>
-      <w:r>
-        <w:t xml:space="preserve"> ,</w:t>
-      </w:r>
-      <w:proofErr w:type="gramEnd"/>
+      <w:r>
+        <w:t xml:space="preserve">sauf colonne AX </w:t>
+      </w:r>
+    </w:p>
+    <w:p>
+      <w:r>
+        <w:t>Colonne 21 = tracking à trier de A à Z</w:t>
+      </w:r>
       <w:r>
         <w:t xml:space="preserve"> </w:t>
       </w:r>
-      <w:proofErr w:type="spellStart"/>
-      <w:r>
-        <w:t>verification</w:t>
-      </w:r>
-      <w:proofErr w:type="spellEnd"/>
+    </w:p>
+    <w:p>
+      <w:r>
+        <w:t xml:space="preserve">Colonne D = vérifier vide ou n/a </w:t>
+      </w:r>
+      <w:r>
+        <w:t>(pas</w:t>
+      </w:r>
+      <w:r>
+        <w:t xml:space="preserve"> de tracking on </w:t>
+      </w:r>
+      <w:r>
+        <w:t>élève)</w:t>
+      </w:r>
+    </w:p>
+    <w:p>
+      <w:r>
+        <w:t xml:space="preserve">Suivre l’ordre des faits dans le fichier </w:t>
+      </w:r>
+      <w:r>
+        <w:t>Word</w:t>
+      </w:r>
       <w:r>
         <w:t xml:space="preserve"> </w:t>
       </w:r>
-      <w:proofErr w:type="gramStart"/>
-      <w:r>
-        <w:t>des fret</w:t>
-      </w:r>
-      <w:proofErr w:type="gramEnd"/>
-      <w:r>
-        <w:t xml:space="preserve"> à </w:t>
-      </w:r>
-      <w:proofErr w:type="spellStart"/>
-      <w:proofErr w:type="gramStart"/>
-      <w:r>
-        <w:t>zero</w:t>
-      </w:r>
-      <w:proofErr w:type="spellEnd"/>
-      <w:r>
-        <w:t xml:space="preserve"> ,</w:t>
-      </w:r>
-      <w:proofErr w:type="gramEnd"/>
-      <w:r>
-        <w:t xml:space="preserve"> taxe </w:t>
-      </w:r>
-      <w:proofErr w:type="spellStart"/>
-      <w:r>
-        <w:t>gazoile</w:t>
-      </w:r>
-      <w:proofErr w:type="spellEnd"/>
-      <w:r>
-        <w:t xml:space="preserve"> à rajouter sur </w:t>
-      </w:r>
-      <w:proofErr w:type="spellStart"/>
-      <w:r>
-        <w:t>l’erp</w:t>
-      </w:r>
-      <w:proofErr w:type="spellEnd"/>
+    </w:p>
+    <w:p>
+      <w:r>
+        <w:t xml:space="preserve">Nbr de colis fichier import </w:t>
+      </w:r>
+    </w:p>
+    <w:p>
+      <w:r>
+        <w:t xml:space="preserve">Pout </w:t>
+      </w:r>
+      <w:r>
+        <w:t>multi colis</w:t>
+      </w:r>
+      <w:r>
+        <w:t xml:space="preserve"> s : 1 </w:t>
+      </w:r>
+      <w:r>
+        <w:t>réf</w:t>
+      </w:r>
+      <w:r>
+        <w:t xml:space="preserve"> tracking maitre</w:t>
+      </w:r>
+    </w:p>
+    <w:p>
       <w:r>
         <w:t xml:space="preserve"> </w:t>
       </w:r>
-    </w:p>
-    <w:p/>
-    <w:p>
-      <w:r>
-        <w:t xml:space="preserve">** Lettres : filtre sur les </w:t>
-      </w:r>
-      <w:proofErr w:type="spellStart"/>
-      <w:r>
-        <w:t>expe</w:t>
-      </w:r>
-      <w:proofErr w:type="spellEnd"/>
+      <w:r>
+        <w:t>Vérifier</w:t>
+      </w:r>
       <w:r>
         <w:t xml:space="preserve"> </w:t>
       </w:r>
-      <w:proofErr w:type="gramStart"/>
-      <w:r>
-        <w:t>bruts ,</w:t>
-      </w:r>
-      <w:proofErr w:type="gramEnd"/>
-      <w:r>
-        <w:t xml:space="preserve"> vider tous le </w:t>
-      </w:r>
-      <w:proofErr w:type="spellStart"/>
-      <w:r>
-        <w:t>stracking</w:t>
-      </w:r>
-      <w:proofErr w:type="spellEnd"/>
-      <w:r>
-        <w:t xml:space="preserve"> vide colonne </w:t>
-      </w:r>
-      <w:proofErr w:type="spellStart"/>
-      <w:proofErr w:type="gramStart"/>
-      <w:r>
-        <w:t>bleur</w:t>
-      </w:r>
-      <w:proofErr w:type="spellEnd"/>
-      <w:r>
-        <w:t xml:space="preserve"> ,</w:t>
-      </w:r>
-      <w:proofErr w:type="gramEnd"/>
-      <w:r>
-        <w:t xml:space="preserve"> et les rechercher dans </w:t>
-      </w:r>
-      <w:proofErr w:type="gramStart"/>
-      <w:r>
-        <w:t>un exports</w:t>
-      </w:r>
-      <w:proofErr w:type="gramEnd"/>
-      <w:r>
-        <w:t xml:space="preserve"> depuis l </w:t>
-      </w:r>
-      <w:proofErr w:type="spellStart"/>
-      <w:proofErr w:type="gramStart"/>
-      <w:r>
-        <w:t>erp</w:t>
-      </w:r>
-      <w:proofErr w:type="spellEnd"/>
-      <w:r>
-        <w:t xml:space="preserve"> ,</w:t>
-      </w:r>
-      <w:proofErr w:type="gramEnd"/>
-      <w:r>
-        <w:t xml:space="preserve"> et ceux dont y a un </w:t>
-      </w:r>
-      <w:proofErr w:type="spellStart"/>
-      <w:proofErr w:type="gramStart"/>
-      <w:r>
-        <w:t>zero</w:t>
-      </w:r>
-      <w:proofErr w:type="spellEnd"/>
-      <w:r>
-        <w:t xml:space="preserve"> ,</w:t>
-      </w:r>
-      <w:proofErr w:type="gramEnd"/>
-      <w:r>
-        <w:t xml:space="preserve"> on </w:t>
-      </w:r>
-      <w:proofErr w:type="gramStart"/>
-      <w:r>
-        <w:t>mets</w:t>
-      </w:r>
-      <w:proofErr w:type="gramEnd"/>
-      <w:r>
-        <w:t xml:space="preserve"> </w:t>
-      </w:r>
-      <w:proofErr w:type="spellStart"/>
-      <w:r>
-        <w:t>numero</w:t>
-      </w:r>
-      <w:proofErr w:type="spellEnd"/>
-      <w:r>
-        <w:t xml:space="preserve"> de </w:t>
-      </w:r>
-      <w:proofErr w:type="spellStart"/>
-      <w:r>
-        <w:t>tracking</w:t>
-      </w:r>
-      <w:proofErr w:type="spellEnd"/>
-      <w:r>
-        <w:t xml:space="preserve"> = </w:t>
-      </w:r>
-      <w:proofErr w:type="spellStart"/>
-      <w:r>
-        <w:t>numero</w:t>
-      </w:r>
-      <w:proofErr w:type="spellEnd"/>
-      <w:r>
-        <w:t xml:space="preserve"> d’</w:t>
-      </w:r>
-      <w:proofErr w:type="spellStart"/>
-      <w:r>
-        <w:t>expeditions</w:t>
-      </w:r>
-      <w:proofErr w:type="spellEnd"/>
-      <w:r>
-        <w:t xml:space="preserve"> et en le mets en </w:t>
-      </w:r>
-      <w:proofErr w:type="spellStart"/>
-      <w:r>
-        <w:t>coleur</w:t>
-      </w:r>
-      <w:proofErr w:type="spellEnd"/>
-      <w:r>
-        <w:t xml:space="preserve"> bleu foncé et on </w:t>
-      </w:r>
-      <w:proofErr w:type="spellStart"/>
-      <w:r>
-        <w:t>lets</w:t>
-      </w:r>
-      <w:proofErr w:type="spellEnd"/>
-      <w:r>
-        <w:t xml:space="preserve"> à jour dans </w:t>
-      </w:r>
-      <w:proofErr w:type="spellStart"/>
-      <w:r>
-        <w:t>l’erp</w:t>
-      </w:r>
-      <w:proofErr w:type="spellEnd"/>
-      <w:r>
-        <w:t xml:space="preserve"> le </w:t>
-      </w:r>
-      <w:proofErr w:type="spellStart"/>
-      <w:r>
-        <w:t>numero</w:t>
-      </w:r>
-      <w:proofErr w:type="spellEnd"/>
-      <w:r>
-        <w:t xml:space="preserve"> de </w:t>
-      </w:r>
-      <w:proofErr w:type="spellStart"/>
-      <w:r>
-        <w:t>tracking</w:t>
-      </w:r>
-      <w:proofErr w:type="spellEnd"/>
-      <w:r>
-        <w:t xml:space="preserve"> (sauf </w:t>
-      </w:r>
-      <w:proofErr w:type="spellStart"/>
-      <w:r>
-        <w:t>expe</w:t>
-      </w:r>
-      <w:proofErr w:type="spellEnd"/>
-      <w:r>
-        <w:t xml:space="preserve"> en cours de </w:t>
-      </w:r>
-      <w:proofErr w:type="spellStart"/>
-      <w:r>
-        <w:t>preparation</w:t>
-      </w:r>
-      <w:proofErr w:type="spellEnd"/>
-      <w:r>
-        <w:t xml:space="preserve"> à ne pas facturer et les bien </w:t>
-      </w:r>
-      <w:proofErr w:type="gramStart"/>
-      <w:r>
-        <w:t>vérifier )</w:t>
-      </w:r>
-      <w:proofErr w:type="gramEnd"/>
-    </w:p>
-    <w:p>
-      <w:r>
-        <w:t xml:space="preserve">Le </w:t>
-      </w:r>
-      <w:proofErr w:type="spellStart"/>
-      <w:r>
-        <w:t>pro_tracking</w:t>
-      </w:r>
-      <w:proofErr w:type="spellEnd"/>
-      <w:r>
-        <w:t xml:space="preserve"> = BAC25</w:t>
-      </w:r>
-      <w:proofErr w:type="gramStart"/>
-      <w:r>
-        <w:t>* ,</w:t>
-      </w:r>
-      <w:proofErr w:type="gramEnd"/>
-      <w:r>
-        <w:t xml:space="preserve"> faute dans </w:t>
-      </w:r>
-      <w:proofErr w:type="gramStart"/>
-      <w:r>
-        <w:t>l’atelier ,</w:t>
-      </w:r>
-      <w:proofErr w:type="gramEnd"/>
-      <w:r>
-        <w:t xml:space="preserve"> mettre </w:t>
-      </w:r>
-      <w:proofErr w:type="spellStart"/>
-      <w:r>
-        <w:t>numero</w:t>
-      </w:r>
-      <w:proofErr w:type="spellEnd"/>
-      <w:r>
-        <w:t xml:space="preserve"> d’</w:t>
-      </w:r>
-      <w:proofErr w:type="spellStart"/>
-      <w:r>
-        <w:t>expedition</w:t>
-      </w:r>
-      <w:proofErr w:type="spellEnd"/>
-      <w:r>
-        <w:t xml:space="preserve"> en </w:t>
-      </w:r>
-      <w:proofErr w:type="spellStart"/>
-      <w:r>
-        <w:t>tracking</w:t>
-      </w:r>
-      <w:proofErr w:type="spellEnd"/>
-      <w:r>
-        <w:t xml:space="preserve"> </w:t>
-      </w:r>
-    </w:p>
-    <w:p/>
-    <w:p>
-      <w:r>
-        <w:t xml:space="preserve"> </w:t>
-      </w:r>
-    </w:p>
-    <w:p>
-      <w:r>
-        <w:rPr>
-          <w:highlight w:val="yellow"/>
-        </w:rPr>
-        <w:lastRenderedPageBreak/>
-        <w:t>**</w:t>
-      </w:r>
-      <w:proofErr w:type="gramStart"/>
-      <w:r>
-        <w:t>UPS ,</w:t>
-      </w:r>
-      <w:proofErr w:type="gramEnd"/>
-      <w:r>
-        <w:t xml:space="preserve"> enlever </w:t>
-      </w:r>
-      <w:proofErr w:type="spellStart"/>
-      <w:proofErr w:type="gramStart"/>
-      <w:r>
-        <w:t>multitaskeur</w:t>
-      </w:r>
-      <w:proofErr w:type="spellEnd"/>
-      <w:r>
-        <w:t xml:space="preserve">  et</w:t>
-      </w:r>
-      <w:proofErr w:type="gramEnd"/>
-      <w:r>
-        <w:t xml:space="preserve"> </w:t>
-      </w:r>
-      <w:proofErr w:type="spellStart"/>
-      <w:r>
-        <w:t>vitawave</w:t>
-      </w:r>
-      <w:proofErr w:type="spellEnd"/>
-      <w:r>
-        <w:t xml:space="preserve"> : </w:t>
-      </w:r>
-      <w:proofErr w:type="spellStart"/>
-      <w:r>
-        <w:t>telecharegr</w:t>
-      </w:r>
-      <w:proofErr w:type="spellEnd"/>
-      <w:r>
-        <w:t xml:space="preserve"> les factures par paquet de 10 sur le site du transporteur  </w:t>
-      </w:r>
-    </w:p>
-    <w:p>
-      <w:r>
-        <w:t xml:space="preserve">Remplacer point par virgule dans </w:t>
-      </w:r>
-      <w:proofErr w:type="gramStart"/>
-      <w:r>
-        <w:t>tous les colonnes</w:t>
-      </w:r>
-      <w:proofErr w:type="gramEnd"/>
-      <w:r>
-        <w:t xml:space="preserve"> </w:t>
-      </w:r>
-      <w:r>
-        <w:t xml:space="preserve">sauf colonne AX </w:t>
-      </w:r>
-    </w:p>
-    <w:p>
-      <w:r>
-        <w:t xml:space="preserve">Colonne 21 = </w:t>
-      </w:r>
-      <w:proofErr w:type="spellStart"/>
-      <w:r>
-        <w:t>tracking</w:t>
-      </w:r>
-      <w:proofErr w:type="spellEnd"/>
-      <w:r>
-        <w:t xml:space="preserve"> à trier de A à Z</w:t>
-      </w:r>
-      <w:r>
-        <w:t xml:space="preserve"> </w:t>
-      </w:r>
-    </w:p>
-    <w:p>
-      <w:r>
-        <w:t xml:space="preserve">Colonne D = vérifier vide ou n/a </w:t>
-      </w:r>
-      <w:proofErr w:type="gramStart"/>
-      <w:r>
-        <w:t>( pas</w:t>
-      </w:r>
-      <w:proofErr w:type="gramEnd"/>
-      <w:r>
-        <w:t xml:space="preserve"> de </w:t>
-      </w:r>
-      <w:proofErr w:type="spellStart"/>
-      <w:r>
-        <w:t>tracking</w:t>
-      </w:r>
-      <w:proofErr w:type="spellEnd"/>
-      <w:r>
-        <w:t xml:space="preserve"> on </w:t>
-      </w:r>
-      <w:proofErr w:type="spellStart"/>
-      <w:proofErr w:type="gramStart"/>
-      <w:r>
-        <w:t>eleve</w:t>
-      </w:r>
-      <w:proofErr w:type="spellEnd"/>
-      <w:r>
-        <w:t xml:space="preserve"> )</w:t>
-      </w:r>
-      <w:proofErr w:type="gramEnd"/>
-    </w:p>
-    <w:p>
-      <w:r>
-        <w:t xml:space="preserve">Suivre l’ordre des faits dans le fichier </w:t>
-      </w:r>
-      <w:proofErr w:type="spellStart"/>
-      <w:r>
-        <w:t>word</w:t>
-      </w:r>
-      <w:proofErr w:type="spellEnd"/>
-      <w:r>
-        <w:t xml:space="preserve"> </w:t>
-      </w:r>
-    </w:p>
-    <w:p>
-      <w:r>
-        <w:t xml:space="preserve">Nbr de colis fichier import </w:t>
-      </w:r>
-    </w:p>
-    <w:p>
-      <w:r>
-        <w:t xml:space="preserve">Pout </w:t>
-      </w:r>
-      <w:proofErr w:type="spellStart"/>
-      <w:r>
-        <w:t>multicoli</w:t>
-      </w:r>
-      <w:proofErr w:type="spellEnd"/>
-      <w:r>
-        <w:t xml:space="preserve"> s : 1 </w:t>
-      </w:r>
-      <w:proofErr w:type="spellStart"/>
-      <w:r>
-        <w:t>ref</w:t>
-      </w:r>
-      <w:proofErr w:type="spellEnd"/>
-      <w:r>
-        <w:t xml:space="preserve"> </w:t>
-      </w:r>
-      <w:proofErr w:type="spellStart"/>
-      <w:r>
-        <w:t>tracking</w:t>
-      </w:r>
-      <w:proofErr w:type="spellEnd"/>
-      <w:r>
-        <w:t xml:space="preserve"> maitre</w:t>
-      </w:r>
-    </w:p>
-    <w:p>
-      <w:r>
-        <w:t xml:space="preserve"> </w:t>
-      </w:r>
-      <w:proofErr w:type="gramStart"/>
-      <w:r>
-        <w:t>vérifier</w:t>
-      </w:r>
-      <w:proofErr w:type="gramEnd"/>
-      <w:r>
-        <w:t xml:space="preserve"> </w:t>
-      </w:r>
-      <w:proofErr w:type="spellStart"/>
-      <w:r>
-        <w:t>ref</w:t>
-      </w:r>
-      <w:proofErr w:type="spellEnd"/>
-      <w:r>
-        <w:t xml:space="preserve"> des destinations </w:t>
-      </w:r>
-      <w:proofErr w:type="spellStart"/>
-      <w:proofErr w:type="gramStart"/>
-      <w:r>
-        <w:t>expe</w:t>
-      </w:r>
-      <w:proofErr w:type="spellEnd"/>
-      <w:r>
-        <w:t xml:space="preserve">  selon</w:t>
-      </w:r>
-      <w:proofErr w:type="gramEnd"/>
-      <w:r>
-        <w:t xml:space="preserve"> </w:t>
-      </w:r>
-      <w:proofErr w:type="spellStart"/>
-      <w:r>
-        <w:t>pdf</w:t>
-      </w:r>
-      <w:proofErr w:type="spellEnd"/>
-      <w:r>
-        <w:t xml:space="preserve"> de </w:t>
-      </w:r>
-      <w:proofErr w:type="spellStart"/>
-      <w:r>
-        <w:t>viticolis</w:t>
-      </w:r>
-      <w:proofErr w:type="spellEnd"/>
-      <w:r>
-        <w:t xml:space="preserve"> à demand</w:t>
+      <w:r>
+        <w:t>réf</w:t>
+      </w:r>
+      <w:r>
+        <w:t xml:space="preserve"> des destinations expe selon </w:t>
+      </w:r>
+      <w:r>
+        <w:t>PDF</w:t>
+      </w:r>
+      <w:r>
+        <w:t xml:space="preserve"> de viticolis à demand</w:t>
       </w:r>
       <w:r>
         <w:t>e</w:t>
@@ -876,6 +746,7 @@
     </w:p>
     <w:p>
       <w:r>
+        <w:lastRenderedPageBreak/>
         <w:t xml:space="preserve">Doublon consolidé = déjà facturé sur le mois précédent </w:t>
       </w:r>
     </w:p>
@@ -907,92 +778,48 @@
     </w:p>
     <w:p>
       <w:r>
-        <w:t xml:space="preserve"> Le smic qui augment faut le mapper dans la </w:t>
-      </w:r>
-      <w:proofErr w:type="spellStart"/>
-      <w:r>
-        <w:t>bdd</w:t>
-      </w:r>
-      <w:proofErr w:type="spellEnd"/>
+        <w:t xml:space="preserve"> Le smic qui augment faut le mapper dans la bdd </w:t>
+      </w:r>
+    </w:p>
+    <w:p>
+      <w:r>
+        <w:t xml:space="preserve">Normer les factures par code </w:t>
+      </w:r>
+      <w:r>
+        <w:t>d’expéditions,</w:t>
+      </w:r>
+      <w:r>
+        <w:t xml:space="preserve"> ça impacte que la main </w:t>
+      </w:r>
+      <w:r>
+        <w:t>d’œuvre,</w:t>
+      </w:r>
+      <w:r>
+        <w:t xml:space="preserve"> dans la </w:t>
+      </w:r>
+      <w:r>
+        <w:t>facture,</w:t>
+      </w:r>
+      <w:r>
+        <w:t xml:space="preserve"> dans l’onglet </w:t>
+      </w:r>
+      <w:r>
+        <w:t>TCD</w:t>
+      </w:r>
       <w:r>
         <w:t xml:space="preserve"> </w:t>
       </w:r>
-    </w:p>
-    <w:p>
-      <w:r>
-        <w:t xml:space="preserve">Normer les factures par code </w:t>
-      </w:r>
-      <w:proofErr w:type="gramStart"/>
-      <w:r>
-        <w:t>d’</w:t>
-      </w:r>
-      <w:proofErr w:type="spellStart"/>
-      <w:r>
-        <w:t>expeditions</w:t>
-      </w:r>
-      <w:proofErr w:type="spellEnd"/>
-      <w:r>
-        <w:t xml:space="preserve"> ,</w:t>
-      </w:r>
-      <w:proofErr w:type="gramEnd"/>
-      <w:r>
-        <w:t xml:space="preserve"> ça impacte que la main </w:t>
-      </w:r>
-      <w:proofErr w:type="gramStart"/>
-      <w:r>
-        <w:t>d’œuvre ,</w:t>
-      </w:r>
-      <w:proofErr w:type="gramEnd"/>
-      <w:r>
-        <w:t xml:space="preserve"> dans la </w:t>
-      </w:r>
-      <w:proofErr w:type="gramStart"/>
-      <w:r>
-        <w:t>facture ,</w:t>
-      </w:r>
-      <w:proofErr w:type="gramEnd"/>
-      <w:r>
-        <w:t xml:space="preserve"> dans l’onglet </w:t>
-      </w:r>
-      <w:proofErr w:type="spellStart"/>
-      <w:r>
-        <w:t>tcd</w:t>
-      </w:r>
-      <w:proofErr w:type="spellEnd"/>
-      <w:r>
-        <w:t xml:space="preserve"> </w:t>
-      </w:r>
-      <w:proofErr w:type="spellStart"/>
-      <w:r>
-        <w:t>prepa</w:t>
-      </w:r>
-      <w:proofErr w:type="spellEnd"/>
-      <w:r>
-        <w:t xml:space="preserve"> des </w:t>
-      </w:r>
-      <w:proofErr w:type="gramStart"/>
-      <w:r>
-        <w:t>tarifs ,</w:t>
-      </w:r>
-      <w:proofErr w:type="gramEnd"/>
-      <w:r>
-        <w:t xml:space="preserve"> </w:t>
-      </w:r>
-      <w:proofErr w:type="spellStart"/>
-      <w:r>
-        <w:t>categoriser</w:t>
-      </w:r>
-      <w:proofErr w:type="spellEnd"/>
-      <w:r>
-        <w:t xml:space="preserve"> chaque </w:t>
-      </w:r>
-      <w:proofErr w:type="gramStart"/>
-      <w:r>
-        <w:t>prix ,</w:t>
-      </w:r>
-      <w:proofErr w:type="gramEnd"/>
-      <w:r>
-        <w:t xml:space="preserve"> à arrondir au centime </w:t>
+      <w:r>
+        <w:t>prépa</w:t>
+      </w:r>
+      <w:r>
+        <w:t xml:space="preserve"> des tarifs, </w:t>
+      </w:r>
+      <w:r>
+        <w:t>catégoriser</w:t>
+      </w:r>
+      <w:r>
+        <w:t xml:space="preserve"> chaque prix, à arrondir au centime </w:t>
       </w:r>
     </w:p>
     <w:p/>
@@ -1011,6 +838,119 @@
 <file path=word/numbering.xml><?xml version="1.0" encoding="utf-8"?>
 <w:numbering xmlns:wpc="http://schemas.microsoft.com/office/word/2010/wordprocessingCanvas" xmlns:cx="http://schemas.microsoft.com/office/drawing/2014/chartex" xmlns:cx1="http://schemas.microsoft.com/office/drawing/2015/9/8/chartex" xmlns:cx2="http://schemas.microsoft.com/office/drawing/2015/10/21/chartex" xmlns:cx3="http://schemas.microsoft.com/office/drawing/2016/5/9/chartex" xmlns:cx4="http://schemas.microsoft.com/office/drawing/2016/5/10/chartex" xmlns:cx5="http://schemas.microsoft.com/office/drawing/2016/5/11/chartex" xmlns:cx6="http://schemas.microsoft.com/office/drawing/2016/5/12/chartex" xmlns:cx7="http://schemas.microsoft.com/office/drawing/2016/5/13/chartex" xmlns:cx8="http://schemas.microsoft.com/office/drawing/2016/5/14/chartex" xmlns:mc="http://schemas.openxmlformats.org/markup-compatibility/2006" xmlns:aink="http://schemas.microsoft.com/office/drawing/2016/ink" xmlns:am3d="http://schemas.microsoft.com/office/drawing/2017/model3d" xmlns:o="urn:schemas-microsoft-com:office:office" xmlns:oel="http://schemas.microsoft.com/office/2019/extlst" xmlns:r="http://schemas.openxmlformats.org/officeDocument/2006/relationships" xmlns:m="http://schemas.openxmlformats.org/officeDocument/2006/math" xmlns:v="urn:schemas-microsoft-com:vml" xmlns:wp14="http://schemas.microsoft.com/office/word/2010/wordprocessingDrawing" xmlns:wp="http://schemas.openxmlformats.org/drawingml/2006/wordprocessingDrawing" xmlns:w10="urn:schemas-microsoft-com:office:word" xmlns:w="http://schemas.openxmlformats.org/wordprocessingml/2006/main" xmlns:w14="http://schemas.microsoft.com/office/word/2010/wordml" xmlns:w15="http://schemas.microsoft.com/office/word/2012/wordml" xmlns:w16cex="http://schemas.microsoft.com/office/word/2018/wordml/cex" xmlns:w16cid="http://schemas.microsoft.com/office/word/2016/wordml/cid" xmlns:w16="http://schemas.microsoft.com/office/word/2018/wordml" xmlns:w16du="http://schemas.microsoft.com/office/word/2023/wordml/word16du" xmlns:w16sdtdh="http://schemas.microsoft.com/office/word/2020/wordml/sdtdatahash" xmlns:w16sdtfl="http://schemas.microsoft.com/office/word/2024/wordml/sdtformatlock" xmlns:w16se="http://schemas.microsoft.com/office/word/2015/wordml/symex" xmlns:wpg="http://schemas.microsoft.com/office/word/2010/wordprocessingGroup" xmlns:wpi="http://schemas.microsoft.com/office/word/2010/wordprocessingInk" xmlns:wne="http://schemas.microsoft.com/office/word/2006/wordml" xmlns:wps="http://schemas.microsoft.com/office/word/2010/wordprocessingShape" mc:Ignorable="w14 w15 w16se w16cid w16 w16cex w16sdtdh w16sdtfl w16du wp14">
   <w:abstractNum w:abstractNumId="0" w15:restartNumberingAfterBreak="0">
+    <w:nsid w:val="2DBA7E60"/>
+    <w:multiLevelType w:val="hybridMultilevel"/>
+    <w:tmpl w:val="036CC464"/>
+    <w:lvl w:ilvl="0" w:tplc="040C0001">
+      <w:start w:val="1"/>
+      <w:numFmt w:val="bullet"/>
+      <w:lvlText w:val=""/>
+      <w:lvlJc w:val="left"/>
+      <w:pPr>
+        <w:ind w:left="720" w:hanging="360"/>
+      </w:pPr>
+      <w:rPr>
+        <w:rFonts w:ascii="Symbol" w:hAnsi="Symbol" w:hint="default"/>
+      </w:rPr>
+    </w:lvl>
+    <w:lvl w:ilvl="1" w:tplc="040C0003" w:tentative="1">
+      <w:start w:val="1"/>
+      <w:numFmt w:val="bullet"/>
+      <w:lvlText w:val="o"/>
+      <w:lvlJc w:val="left"/>
+      <w:pPr>
+        <w:ind w:left="1440" w:hanging="360"/>
+      </w:pPr>
+      <w:rPr>
+        <w:rFonts w:ascii="Courier New" w:hAnsi="Courier New" w:cs="Courier New" w:hint="default"/>
+      </w:rPr>
+    </w:lvl>
+    <w:lvl w:ilvl="2" w:tplc="040C0005" w:tentative="1">
+      <w:start w:val="1"/>
+      <w:numFmt w:val="bullet"/>
+      <w:lvlText w:val=""/>
+      <w:lvlJc w:val="left"/>
+      <w:pPr>
+        <w:ind w:left="2160" w:hanging="360"/>
+      </w:pPr>
+      <w:rPr>
+        <w:rFonts w:ascii="Wingdings" w:hAnsi="Wingdings" w:hint="default"/>
+      </w:rPr>
+    </w:lvl>
+    <w:lvl w:ilvl="3" w:tplc="040C0001" w:tentative="1">
+      <w:start w:val="1"/>
+      <w:numFmt w:val="bullet"/>
+      <w:lvlText w:val=""/>
+      <w:lvlJc w:val="left"/>
+      <w:pPr>
+        <w:ind w:left="2880" w:hanging="360"/>
+      </w:pPr>
+      <w:rPr>
+        <w:rFonts w:ascii="Symbol" w:hAnsi="Symbol" w:hint="default"/>
+      </w:rPr>
+    </w:lvl>
+    <w:lvl w:ilvl="4" w:tplc="040C0003" w:tentative="1">
+      <w:start w:val="1"/>
+      <w:numFmt w:val="bullet"/>
+      <w:lvlText w:val="o"/>
+      <w:lvlJc w:val="left"/>
+      <w:pPr>
+        <w:ind w:left="3600" w:hanging="360"/>
+      </w:pPr>
+      <w:rPr>
+        <w:rFonts w:ascii="Courier New" w:hAnsi="Courier New" w:cs="Courier New" w:hint="default"/>
+      </w:rPr>
+    </w:lvl>
+    <w:lvl w:ilvl="5" w:tplc="040C0005" w:tentative="1">
+      <w:start w:val="1"/>
+      <w:numFmt w:val="bullet"/>
+      <w:lvlText w:val=""/>
+      <w:lvlJc w:val="left"/>
+      <w:pPr>
+        <w:ind w:left="4320" w:hanging="360"/>
+      </w:pPr>
+      <w:rPr>
+        <w:rFonts w:ascii="Wingdings" w:hAnsi="Wingdings" w:hint="default"/>
+      </w:rPr>
+    </w:lvl>
+    <w:lvl w:ilvl="6" w:tplc="040C0001" w:tentative="1">
+      <w:start w:val="1"/>
+      <w:numFmt w:val="bullet"/>
+      <w:lvlText w:val=""/>
+      <w:lvlJc w:val="left"/>
+      <w:pPr>
+        <w:ind w:left="5040" w:hanging="360"/>
+      </w:pPr>
+      <w:rPr>
+        <w:rFonts w:ascii="Symbol" w:hAnsi="Symbol" w:hint="default"/>
+      </w:rPr>
+    </w:lvl>
+    <w:lvl w:ilvl="7" w:tplc="040C0003" w:tentative="1">
+      <w:start w:val="1"/>
+      <w:numFmt w:val="bullet"/>
+      <w:lvlText w:val="o"/>
+      <w:lvlJc w:val="left"/>
+      <w:pPr>
+        <w:ind w:left="5760" w:hanging="360"/>
+      </w:pPr>
+      <w:rPr>
+        <w:rFonts w:ascii="Courier New" w:hAnsi="Courier New" w:cs="Courier New" w:hint="default"/>
+      </w:rPr>
+    </w:lvl>
+    <w:lvl w:ilvl="8" w:tplc="040C0005" w:tentative="1">
+      <w:start w:val="1"/>
+      <w:numFmt w:val="bullet"/>
+      <w:lvlText w:val=""/>
+      <w:lvlJc w:val="left"/>
+      <w:pPr>
+        <w:ind w:left="6480" w:hanging="360"/>
+      </w:pPr>
+      <w:rPr>
+        <w:rFonts w:ascii="Wingdings" w:hAnsi="Wingdings" w:hint="default"/>
+      </w:rPr>
+    </w:lvl>
+  </w:abstractNum>
+  <w:abstractNum w:abstractNumId="1" w15:restartNumberingAfterBreak="0">
     <w:nsid w:val="3B317713"/>
     <w:multiLevelType w:val="hybridMultilevel"/>
     <w:tmpl w:val="304C315A"/>
@@ -1099,7 +1039,358 @@
       </w:pPr>
     </w:lvl>
   </w:abstractNum>
+  <w:abstractNum w:abstractNumId="2" w15:restartNumberingAfterBreak="0">
+    <w:nsid w:val="40F377EA"/>
+    <w:multiLevelType w:val="hybridMultilevel"/>
+    <w:tmpl w:val="4692E616"/>
+    <w:lvl w:ilvl="0" w:tplc="040C0001">
+      <w:start w:val="1"/>
+      <w:numFmt w:val="bullet"/>
+      <w:lvlText w:val=""/>
+      <w:lvlJc w:val="left"/>
+      <w:pPr>
+        <w:ind w:left="720" w:hanging="360"/>
+      </w:pPr>
+      <w:rPr>
+        <w:rFonts w:ascii="Symbol" w:hAnsi="Symbol" w:hint="default"/>
+      </w:rPr>
+    </w:lvl>
+    <w:lvl w:ilvl="1" w:tplc="040C0003" w:tentative="1">
+      <w:start w:val="1"/>
+      <w:numFmt w:val="bullet"/>
+      <w:lvlText w:val="o"/>
+      <w:lvlJc w:val="left"/>
+      <w:pPr>
+        <w:ind w:left="1440" w:hanging="360"/>
+      </w:pPr>
+      <w:rPr>
+        <w:rFonts w:ascii="Courier New" w:hAnsi="Courier New" w:cs="Courier New" w:hint="default"/>
+      </w:rPr>
+    </w:lvl>
+    <w:lvl w:ilvl="2" w:tplc="040C0005" w:tentative="1">
+      <w:start w:val="1"/>
+      <w:numFmt w:val="bullet"/>
+      <w:lvlText w:val=""/>
+      <w:lvlJc w:val="left"/>
+      <w:pPr>
+        <w:ind w:left="2160" w:hanging="360"/>
+      </w:pPr>
+      <w:rPr>
+        <w:rFonts w:ascii="Wingdings" w:hAnsi="Wingdings" w:hint="default"/>
+      </w:rPr>
+    </w:lvl>
+    <w:lvl w:ilvl="3" w:tplc="040C0001" w:tentative="1">
+      <w:start w:val="1"/>
+      <w:numFmt w:val="bullet"/>
+      <w:lvlText w:val=""/>
+      <w:lvlJc w:val="left"/>
+      <w:pPr>
+        <w:ind w:left="2880" w:hanging="360"/>
+      </w:pPr>
+      <w:rPr>
+        <w:rFonts w:ascii="Symbol" w:hAnsi="Symbol" w:hint="default"/>
+      </w:rPr>
+    </w:lvl>
+    <w:lvl w:ilvl="4" w:tplc="040C0003" w:tentative="1">
+      <w:start w:val="1"/>
+      <w:numFmt w:val="bullet"/>
+      <w:lvlText w:val="o"/>
+      <w:lvlJc w:val="left"/>
+      <w:pPr>
+        <w:ind w:left="3600" w:hanging="360"/>
+      </w:pPr>
+      <w:rPr>
+        <w:rFonts w:ascii="Courier New" w:hAnsi="Courier New" w:cs="Courier New" w:hint="default"/>
+      </w:rPr>
+    </w:lvl>
+    <w:lvl w:ilvl="5" w:tplc="040C0005" w:tentative="1">
+      <w:start w:val="1"/>
+      <w:numFmt w:val="bullet"/>
+      <w:lvlText w:val=""/>
+      <w:lvlJc w:val="left"/>
+      <w:pPr>
+        <w:ind w:left="4320" w:hanging="360"/>
+      </w:pPr>
+      <w:rPr>
+        <w:rFonts w:ascii="Wingdings" w:hAnsi="Wingdings" w:hint="default"/>
+      </w:rPr>
+    </w:lvl>
+    <w:lvl w:ilvl="6" w:tplc="040C0001" w:tentative="1">
+      <w:start w:val="1"/>
+      <w:numFmt w:val="bullet"/>
+      <w:lvlText w:val=""/>
+      <w:lvlJc w:val="left"/>
+      <w:pPr>
+        <w:ind w:left="5040" w:hanging="360"/>
+      </w:pPr>
+      <w:rPr>
+        <w:rFonts w:ascii="Symbol" w:hAnsi="Symbol" w:hint="default"/>
+      </w:rPr>
+    </w:lvl>
+    <w:lvl w:ilvl="7" w:tplc="040C0003" w:tentative="1">
+      <w:start w:val="1"/>
+      <w:numFmt w:val="bullet"/>
+      <w:lvlText w:val="o"/>
+      <w:lvlJc w:val="left"/>
+      <w:pPr>
+        <w:ind w:left="5760" w:hanging="360"/>
+      </w:pPr>
+      <w:rPr>
+        <w:rFonts w:ascii="Courier New" w:hAnsi="Courier New" w:cs="Courier New" w:hint="default"/>
+      </w:rPr>
+    </w:lvl>
+    <w:lvl w:ilvl="8" w:tplc="040C0005" w:tentative="1">
+      <w:start w:val="1"/>
+      <w:numFmt w:val="bullet"/>
+      <w:lvlText w:val=""/>
+      <w:lvlJc w:val="left"/>
+      <w:pPr>
+        <w:ind w:left="6480" w:hanging="360"/>
+      </w:pPr>
+      <w:rPr>
+        <w:rFonts w:ascii="Wingdings" w:hAnsi="Wingdings" w:hint="default"/>
+      </w:rPr>
+    </w:lvl>
+  </w:abstractNum>
+  <w:abstractNum w:abstractNumId="3" w15:restartNumberingAfterBreak="0">
+    <w:nsid w:val="50EB1EBF"/>
+    <w:multiLevelType w:val="hybridMultilevel"/>
+    <w:tmpl w:val="83DE6314"/>
+    <w:lvl w:ilvl="0" w:tplc="040C0001">
+      <w:start w:val="1"/>
+      <w:numFmt w:val="bullet"/>
+      <w:lvlText w:val=""/>
+      <w:lvlJc w:val="left"/>
+      <w:pPr>
+        <w:ind w:left="720" w:hanging="360"/>
+      </w:pPr>
+      <w:rPr>
+        <w:rFonts w:ascii="Symbol" w:hAnsi="Symbol" w:hint="default"/>
+      </w:rPr>
+    </w:lvl>
+    <w:lvl w:ilvl="1" w:tplc="040C0003" w:tentative="1">
+      <w:start w:val="1"/>
+      <w:numFmt w:val="bullet"/>
+      <w:lvlText w:val="o"/>
+      <w:lvlJc w:val="left"/>
+      <w:pPr>
+        <w:ind w:left="1440" w:hanging="360"/>
+      </w:pPr>
+      <w:rPr>
+        <w:rFonts w:ascii="Courier New" w:hAnsi="Courier New" w:cs="Courier New" w:hint="default"/>
+      </w:rPr>
+    </w:lvl>
+    <w:lvl w:ilvl="2" w:tplc="040C0005" w:tentative="1">
+      <w:start w:val="1"/>
+      <w:numFmt w:val="bullet"/>
+      <w:lvlText w:val=""/>
+      <w:lvlJc w:val="left"/>
+      <w:pPr>
+        <w:ind w:left="2160" w:hanging="360"/>
+      </w:pPr>
+      <w:rPr>
+        <w:rFonts w:ascii="Wingdings" w:hAnsi="Wingdings" w:hint="default"/>
+      </w:rPr>
+    </w:lvl>
+    <w:lvl w:ilvl="3" w:tplc="040C0001" w:tentative="1">
+      <w:start w:val="1"/>
+      <w:numFmt w:val="bullet"/>
+      <w:lvlText w:val=""/>
+      <w:lvlJc w:val="left"/>
+      <w:pPr>
+        <w:ind w:left="2880" w:hanging="360"/>
+      </w:pPr>
+      <w:rPr>
+        <w:rFonts w:ascii="Symbol" w:hAnsi="Symbol" w:hint="default"/>
+      </w:rPr>
+    </w:lvl>
+    <w:lvl w:ilvl="4" w:tplc="040C0003" w:tentative="1">
+      <w:start w:val="1"/>
+      <w:numFmt w:val="bullet"/>
+      <w:lvlText w:val="o"/>
+      <w:lvlJc w:val="left"/>
+      <w:pPr>
+        <w:ind w:left="3600" w:hanging="360"/>
+      </w:pPr>
+      <w:rPr>
+        <w:rFonts w:ascii="Courier New" w:hAnsi="Courier New" w:cs="Courier New" w:hint="default"/>
+      </w:rPr>
+    </w:lvl>
+    <w:lvl w:ilvl="5" w:tplc="040C0005" w:tentative="1">
+      <w:start w:val="1"/>
+      <w:numFmt w:val="bullet"/>
+      <w:lvlText w:val=""/>
+      <w:lvlJc w:val="left"/>
+      <w:pPr>
+        <w:ind w:left="4320" w:hanging="360"/>
+      </w:pPr>
+      <w:rPr>
+        <w:rFonts w:ascii="Wingdings" w:hAnsi="Wingdings" w:hint="default"/>
+      </w:rPr>
+    </w:lvl>
+    <w:lvl w:ilvl="6" w:tplc="040C0001" w:tentative="1">
+      <w:start w:val="1"/>
+      <w:numFmt w:val="bullet"/>
+      <w:lvlText w:val=""/>
+      <w:lvlJc w:val="left"/>
+      <w:pPr>
+        <w:ind w:left="5040" w:hanging="360"/>
+      </w:pPr>
+      <w:rPr>
+        <w:rFonts w:ascii="Symbol" w:hAnsi="Symbol" w:hint="default"/>
+      </w:rPr>
+    </w:lvl>
+    <w:lvl w:ilvl="7" w:tplc="040C0003" w:tentative="1">
+      <w:start w:val="1"/>
+      <w:numFmt w:val="bullet"/>
+      <w:lvlText w:val="o"/>
+      <w:lvlJc w:val="left"/>
+      <w:pPr>
+        <w:ind w:left="5760" w:hanging="360"/>
+      </w:pPr>
+      <w:rPr>
+        <w:rFonts w:ascii="Courier New" w:hAnsi="Courier New" w:cs="Courier New" w:hint="default"/>
+      </w:rPr>
+    </w:lvl>
+    <w:lvl w:ilvl="8" w:tplc="040C0005" w:tentative="1">
+      <w:start w:val="1"/>
+      <w:numFmt w:val="bullet"/>
+      <w:lvlText w:val=""/>
+      <w:lvlJc w:val="left"/>
+      <w:pPr>
+        <w:ind w:left="6480" w:hanging="360"/>
+      </w:pPr>
+      <w:rPr>
+        <w:rFonts w:ascii="Wingdings" w:hAnsi="Wingdings" w:hint="default"/>
+      </w:rPr>
+    </w:lvl>
+  </w:abstractNum>
+  <w:abstractNum w:abstractNumId="4" w15:restartNumberingAfterBreak="0">
+    <w:nsid w:val="570F3563"/>
+    <w:multiLevelType w:val="hybridMultilevel"/>
+    <w:tmpl w:val="9BD4A138"/>
+    <w:lvl w:ilvl="0" w:tplc="040C0001">
+      <w:start w:val="1"/>
+      <w:numFmt w:val="bullet"/>
+      <w:lvlText w:val=""/>
+      <w:lvlJc w:val="left"/>
+      <w:pPr>
+        <w:ind w:left="1440" w:hanging="360"/>
+      </w:pPr>
+      <w:rPr>
+        <w:rFonts w:ascii="Symbol" w:hAnsi="Symbol" w:hint="default"/>
+      </w:rPr>
+    </w:lvl>
+    <w:lvl w:ilvl="1" w:tplc="040C0003" w:tentative="1">
+      <w:start w:val="1"/>
+      <w:numFmt w:val="bullet"/>
+      <w:lvlText w:val="o"/>
+      <w:lvlJc w:val="left"/>
+      <w:pPr>
+        <w:ind w:left="2160" w:hanging="360"/>
+      </w:pPr>
+      <w:rPr>
+        <w:rFonts w:ascii="Courier New" w:hAnsi="Courier New" w:cs="Courier New" w:hint="default"/>
+      </w:rPr>
+    </w:lvl>
+    <w:lvl w:ilvl="2" w:tplc="040C0005" w:tentative="1">
+      <w:start w:val="1"/>
+      <w:numFmt w:val="bullet"/>
+      <w:lvlText w:val=""/>
+      <w:lvlJc w:val="left"/>
+      <w:pPr>
+        <w:ind w:left="2880" w:hanging="360"/>
+      </w:pPr>
+      <w:rPr>
+        <w:rFonts w:ascii="Wingdings" w:hAnsi="Wingdings" w:hint="default"/>
+      </w:rPr>
+    </w:lvl>
+    <w:lvl w:ilvl="3" w:tplc="040C0001" w:tentative="1">
+      <w:start w:val="1"/>
+      <w:numFmt w:val="bullet"/>
+      <w:lvlText w:val=""/>
+      <w:lvlJc w:val="left"/>
+      <w:pPr>
+        <w:ind w:left="3600" w:hanging="360"/>
+      </w:pPr>
+      <w:rPr>
+        <w:rFonts w:ascii="Symbol" w:hAnsi="Symbol" w:hint="default"/>
+      </w:rPr>
+    </w:lvl>
+    <w:lvl w:ilvl="4" w:tplc="040C0003" w:tentative="1">
+      <w:start w:val="1"/>
+      <w:numFmt w:val="bullet"/>
+      <w:lvlText w:val="o"/>
+      <w:lvlJc w:val="left"/>
+      <w:pPr>
+        <w:ind w:left="4320" w:hanging="360"/>
+      </w:pPr>
+      <w:rPr>
+        <w:rFonts w:ascii="Courier New" w:hAnsi="Courier New" w:cs="Courier New" w:hint="default"/>
+      </w:rPr>
+    </w:lvl>
+    <w:lvl w:ilvl="5" w:tplc="040C0005" w:tentative="1">
+      <w:start w:val="1"/>
+      <w:numFmt w:val="bullet"/>
+      <w:lvlText w:val=""/>
+      <w:lvlJc w:val="left"/>
+      <w:pPr>
+        <w:ind w:left="5040" w:hanging="360"/>
+      </w:pPr>
+      <w:rPr>
+        <w:rFonts w:ascii="Wingdings" w:hAnsi="Wingdings" w:hint="default"/>
+      </w:rPr>
+    </w:lvl>
+    <w:lvl w:ilvl="6" w:tplc="040C0001" w:tentative="1">
+      <w:start w:val="1"/>
+      <w:numFmt w:val="bullet"/>
+      <w:lvlText w:val=""/>
+      <w:lvlJc w:val="left"/>
+      <w:pPr>
+        <w:ind w:left="5760" w:hanging="360"/>
+      </w:pPr>
+      <w:rPr>
+        <w:rFonts w:ascii="Symbol" w:hAnsi="Symbol" w:hint="default"/>
+      </w:rPr>
+    </w:lvl>
+    <w:lvl w:ilvl="7" w:tplc="040C0003" w:tentative="1">
+      <w:start w:val="1"/>
+      <w:numFmt w:val="bullet"/>
+      <w:lvlText w:val="o"/>
+      <w:lvlJc w:val="left"/>
+      <w:pPr>
+        <w:ind w:left="6480" w:hanging="360"/>
+      </w:pPr>
+      <w:rPr>
+        <w:rFonts w:ascii="Courier New" w:hAnsi="Courier New" w:cs="Courier New" w:hint="default"/>
+      </w:rPr>
+    </w:lvl>
+    <w:lvl w:ilvl="8" w:tplc="040C0005" w:tentative="1">
+      <w:start w:val="1"/>
+      <w:numFmt w:val="bullet"/>
+      <w:lvlText w:val=""/>
+      <w:lvlJc w:val="left"/>
+      <w:pPr>
+        <w:ind w:left="7200" w:hanging="360"/>
+      </w:pPr>
+      <w:rPr>
+        <w:rFonts w:ascii="Wingdings" w:hAnsi="Wingdings" w:hint="default"/>
+      </w:rPr>
+    </w:lvl>
+  </w:abstractNum>
   <w:num w:numId="1" w16cid:durableId="1126045229">
+    <w:abstractNumId w:val="1"/>
+  </w:num>
+  <w:num w:numId="2" w16cid:durableId="1589650875">
+    <w:abstractNumId w:val="2"/>
+  </w:num>
+  <w:num w:numId="3" w16cid:durableId="1543596788">
+    <w:abstractNumId w:val="3"/>
+  </w:num>
+  <w:num w:numId="4" w16cid:durableId="665321570">
+    <w:abstractNumId w:val="4"/>
+  </w:num>
+  <w:num w:numId="5" w16cid:durableId="1795253015">
     <w:abstractNumId w:val="0"/>
   </w:num>
 </w:numbering>

</xml_diff>

<commit_message>
Add BLS and Mondial Relay finalizer scripts, sample carrier files, and docs
Includes generated BLS/Mondial Relay Python finalizers, sample invoice/PDF
fixtures for BLS/DPD/Mondial Relay, and video process transcriptions.
</commit_message>
<xml_diff>
--- a/Documentation/Notes.docx
+++ b/Documentation/Notes.docx
@@ -1,6 +1,6 @@
 
 <file path=word/document.xml><?xml version="1.0" encoding="utf-8"?>
-<w:document xmlns:wpc="http://schemas.microsoft.com/office/word/2010/wordprocessingCanvas" xmlns:cx="http://schemas.microsoft.com/office/drawing/2014/chartex" xmlns:cx1="http://schemas.microsoft.com/office/drawing/2015/9/8/chartex" xmlns:cx2="http://schemas.microsoft.com/office/drawing/2015/10/21/chartex" xmlns:cx3="http://schemas.microsoft.com/office/drawing/2016/5/9/chartex" xmlns:cx4="http://schemas.microsoft.com/office/drawing/2016/5/10/chartex" xmlns:cx5="http://schemas.microsoft.com/office/drawing/2016/5/11/chartex" xmlns:cx6="http://schemas.microsoft.com/office/drawing/2016/5/12/chartex" xmlns:cx7="http://schemas.microsoft.com/office/drawing/2016/5/13/chartex" xmlns:cx8="http://schemas.microsoft.com/office/drawing/2016/5/14/chartex" xmlns:mc="http://schemas.openxmlformats.org/markup-compatibility/2006" xmlns:aink="http://schemas.microsoft.com/office/drawing/2016/ink" xmlns:am3d="http://schemas.microsoft.com/office/drawing/2017/model3d" xmlns:o="urn:schemas-microsoft-com:office:office" xmlns:oel="http://schemas.microsoft.com/office/2019/extlst" xmlns:r="http://schemas.openxmlformats.org/officeDocument/2006/relationships" xmlns:m="http://schemas.openxmlformats.org/officeDocument/2006/math" xmlns:v="urn:schemas-microsoft-com:vml" xmlns:wp14="http://schemas.microsoft.com/office/word/2010/wordprocessingDrawing" xmlns:wp="http://schemas.openxmlformats.org/drawingml/2006/wordprocessingDrawing" xmlns:w10="urn:schemas-microsoft-com:office:word" xmlns:w="http://schemas.openxmlformats.org/wordprocessingml/2006/main" xmlns:w14="http://schemas.microsoft.com/office/word/2010/wordml" xmlns:w15="http://schemas.microsoft.com/office/word/2012/wordml" xmlns:w16cex="http://schemas.microsoft.com/office/word/2018/wordml/cex" xmlns:w16cid="http://schemas.microsoft.com/office/word/2016/wordml/cid" xmlns:w16="http://schemas.microsoft.com/office/word/2018/wordml" xmlns:w16du="http://schemas.microsoft.com/office/word/2023/wordml/word16du" xmlns:w16sdtdh="http://schemas.microsoft.com/office/word/2020/wordml/sdtdatahash" xmlns:w16sdtfl="http://schemas.microsoft.com/office/word/2024/wordml/sdtformatlock" xmlns:w16se="http://schemas.microsoft.com/office/word/2015/wordml/symex" xmlns:wpg="http://schemas.microsoft.com/office/word/2010/wordprocessingGroup" xmlns:wpi="http://schemas.microsoft.com/office/word/2010/wordprocessingInk" xmlns:wne="http://schemas.microsoft.com/office/word/2006/wordml" xmlns:wps="http://schemas.microsoft.com/office/word/2010/wordprocessingShape" mc:Ignorable="w14 w15 w16se w16cid w16 w16cex w16sdtdh w16sdtfl w16du wp14">
+<w:document xmlns:wpc="http://schemas.microsoft.com/office/word/2010/wordprocessingCanvas" xmlns:cx="http://schemas.microsoft.com/office/drawing/2014/chartex" xmlns:cx1="http://schemas.microsoft.com/office/drawing/2015/9/8/chartex" xmlns:cx2="http://schemas.microsoft.com/office/drawing/2015/10/21/chartex" xmlns:cx3="http://schemas.microsoft.com/office/drawing/2016/5/9/chartex" xmlns:cx4="http://schemas.microsoft.com/office/drawing/2016/5/10/chartex" xmlns:cx5="http://schemas.microsoft.com/office/drawing/2016/5/11/chartex" xmlns:cx6="http://schemas.microsoft.com/office/drawing/2016/5/12/chartex" xmlns:cx7="http://schemas.microsoft.com/office/drawing/2016/5/13/chartex" xmlns:cx8="http://schemas.microsoft.com/office/drawing/2016/5/14/chartex" xmlns:mc="http://schemas.openxmlformats.org/markup-compatibility/2006" xmlns:aink="http://schemas.microsoft.com/office/drawing/2016/ink" xmlns:am3d="http://schemas.microsoft.com/office/drawing/2017/model3d" xmlns:o="urn:schemas-microsoft-com:office:office" xmlns:oel="http://schemas.microsoft.com/office/2019/extlst" xmlns:r="http://schemas.openxmlformats.org/officeDocument/2006/relationships" xmlns:m="http://schemas.openxmlformats.org/officeDocument/2006/math" xmlns:v="urn:schemas-microsoft-com:vml" xmlns:wp14="http://schemas.microsoft.com/office/word/2010/wordprocessingDrawing" xmlns:wp="http://schemas.openxmlformats.org/drawingml/2006/wordprocessingDrawing" xmlns:w10="urn:schemas-microsoft-com:office:word" xmlns:w="http://schemas.openxmlformats.org/wordprocessingml/2006/main" xmlns:w14="http://schemas.microsoft.com/office/word/2010/wordml" xmlns:w15="http://schemas.microsoft.com/office/word/2012/wordml" xmlns:w16cei="http://schemas.microsoft.com/office/word/2026/wordml/cei" xmlns:w16cex="http://schemas.microsoft.com/office/word/2018/wordml/cex" xmlns:w16cid="http://schemas.microsoft.com/office/word/2016/wordml/cid" xmlns:w16="http://schemas.microsoft.com/office/word/2018/wordml" xmlns:w16du="http://schemas.microsoft.com/office/word/2023/wordml/word16du" xmlns:w16sdtdh="http://schemas.microsoft.com/office/word/2020/wordml/sdtdatahash" xmlns:w16sdtfl="http://schemas.microsoft.com/office/word/2024/wordml/sdtformatlock" xmlns:w16se="http://schemas.microsoft.com/office/word/2015/wordml/symex" xmlns:wpg="http://schemas.microsoft.com/office/word/2010/wordprocessingGroup" xmlns:wpi="http://schemas.microsoft.com/office/word/2010/wordprocessingInk" xmlns:wne="http://schemas.microsoft.com/office/word/2006/wordml" xmlns:wps="http://schemas.microsoft.com/office/word/2010/wordprocessingShape" mc:Ignorable="w14 w15 w16se w16cid w16 w16cex w16sdtdh w16sdtfl w16du wp14">
   <w:body>
     <w:p>
       <w:pPr>
@@ -283,10 +283,19 @@
     <w:p/>
     <w:p>
       <w:r>
+        <w:rPr>
+          <w:highlight w:val="yellow"/>
+        </w:rPr>
         <w:t>**</w:t>
       </w:r>
       <w:r>
-        <w:t xml:space="preserve">Delivengo = fret =1.0 </w:t>
+        <w:rPr>
+          <w:highlight w:val="yellow"/>
+        </w:rPr>
+        <w:t>Delivengo</w:t>
+      </w:r>
+      <w:r>
+        <w:t xml:space="preserve"> = fret =1.0 </w:t>
       </w:r>
       <w:r>
         <w:t>on ne facture rien</w:t>
@@ -426,6 +435,11 @@
     </w:p>
     <w:p>
       <w:r>
+        <w:t xml:space="preserve">Vérifier les même nombre de colonne et les même colones existent </w:t>
+      </w:r>
+    </w:p>
+    <w:p>
+      <w:r>
         <w:t xml:space="preserve">**BLS est fait </w:t>
       </w:r>
     </w:p>
@@ -479,7 +493,13 @@
         <w:t>zéro,</w:t>
       </w:r>
       <w:r>
-        <w:t xml:space="preserve"> taxe </w:t>
+        <w:t xml:space="preserve"> </w:t>
+      </w:r>
+      <w:r>
+        <w:tab/>
+      </w:r>
+      <w:r>
+        <w:t xml:space="preserve"> </w:t>
       </w:r>
       <w:r>
         <w:t>gazole</w:t>
@@ -494,7 +514,20 @@
         <w:t xml:space="preserve"> </w:t>
       </w:r>
     </w:p>
-    <w:p/>
+    <w:p>
+      <w:r>
+        <w:t>**</w:t>
+      </w:r>
+      <w:r>
+        <w:rPr>
+          <w:highlight w:val="yellow"/>
+        </w:rPr>
+        <w:t>DPD</w:t>
+      </w:r>
+      <w:r>
+        <w:t xml:space="preserve"> : fait </w:t>
+      </w:r>
+    </w:p>
     <w:p>
       <w:r>
         <w:t>** Lettres : filtre sur les exp</w:t>
@@ -607,10 +640,9 @@
         <w:t>expédition</w:t>
       </w:r>
       <w:r>
-        <w:t xml:space="preserve"> en tracking </w:t>
-      </w:r>
-    </w:p>
-    <w:p/>
+        <w:t xml:space="preserve"> en tracking</w:t>
+      </w:r>
+    </w:p>
     <w:p>
       <w:r>
         <w:t xml:space="preserve"> </w:t>
@@ -737,16 +769,53 @@
         <w:t xml:space="preserve">r </w:t>
       </w:r>
     </w:p>
+    <w:p>
+      <w:r>
+        <w:t xml:space="preserve">Zone = 0 : et pas de </w:t>
+      </w:r>
+      <w:proofErr w:type="gramStart"/>
+      <w:r>
+        <w:t>fret ,</w:t>
+      </w:r>
+      <w:proofErr w:type="gramEnd"/>
+      <w:r>
+        <w:t xml:space="preserve"> on </w:t>
+      </w:r>
+      <w:proofErr w:type="spellStart"/>
+      <w:r>
+        <w:t>verifie</w:t>
+      </w:r>
+      <w:proofErr w:type="spellEnd"/>
+      <w:r>
+        <w:t xml:space="preserve"> si y a dans le </w:t>
+      </w:r>
+      <w:proofErr w:type="spellStart"/>
+      <w:r>
+        <w:t>scolonnes</w:t>
+      </w:r>
+      <w:proofErr w:type="spellEnd"/>
+      <w:r>
+        <w:t xml:space="preserve"> autres remplis </w:t>
+      </w:r>
+      <w:proofErr w:type="spellStart"/>
+      <w:r>
+        <w:t>sinn</w:t>
+      </w:r>
+      <w:proofErr w:type="spellEnd"/>
+      <w:r>
+        <w:t xml:space="preserve"> on supp </w:t>
+      </w:r>
+    </w:p>
     <w:p/>
     <w:p/>
     <w:p>
       <w:r>
+        <w:lastRenderedPageBreak/>
         <w:t xml:space="preserve">Import dans le erp -&gt; mappage entité = numéro tracking qui n’existe pas </w:t>
       </w:r>
     </w:p>
     <w:p>
       <w:r>
-        <w:lastRenderedPageBreak/>
         <w:t xml:space="preserve">Doublon consolidé = déjà facturé sur le mois précédent </w:t>
       </w:r>
     </w:p>
@@ -757,14 +826,350 @@
     </w:p>
     <w:p/>
     <w:p/>
+    <w:p>
+      <w:r>
+        <w:t xml:space="preserve">**MR : </w:t>
+      </w:r>
+      <w:r>
+        <w:t xml:space="preserve">(fait manuelle) </w:t>
+      </w:r>
+    </w:p>
+    <w:p>
+      <w:r>
+        <w:t xml:space="preserve">Plusieurs fichiers zip par </w:t>
+      </w:r>
+      <w:proofErr w:type="gramStart"/>
+      <w:r>
+        <w:t>facturation ,</w:t>
+      </w:r>
+      <w:proofErr w:type="gramEnd"/>
+      <w:r>
+        <w:t xml:space="preserve"> tous les points à transformer en virgule depuis le csv de base envoyé par le transporteur </w:t>
+      </w:r>
+    </w:p>
+    <w:p>
+      <w:r>
+        <w:t xml:space="preserve">Une facture pdf par pays , avant c était par pays et par client </w:t>
+      </w:r>
+    </w:p>
+    <w:p>
+      <w:r>
+        <w:t xml:space="preserve">Ecart c’est souvent sur la facture France la </w:t>
+      </w:r>
+      <w:proofErr w:type="gramStart"/>
+      <w:r>
+        <w:t>ruche ,</w:t>
+      </w:r>
+      <w:proofErr w:type="gramEnd"/>
+      <w:r>
+        <w:t xml:space="preserve"> le collecte </w:t>
+      </w:r>
+      <w:proofErr w:type="gramStart"/>
+      <w:r>
+        <w:t>on facture pas</w:t>
+      </w:r>
+      <w:proofErr w:type="gramEnd"/>
+      <w:r>
+        <w:t xml:space="preserve"> au </w:t>
+      </w:r>
+      <w:proofErr w:type="gramStart"/>
+      <w:r>
+        <w:t>clients ,</w:t>
+      </w:r>
+      <w:proofErr w:type="gramEnd"/>
+      <w:r>
+        <w:t xml:space="preserve"> faut l ajouter dans la feuille contrôle </w:t>
+      </w:r>
+    </w:p>
+    <w:p>
+      <w:proofErr w:type="spellStart"/>
+      <w:r>
+        <w:t>Factture</w:t>
+      </w:r>
+      <w:proofErr w:type="spellEnd"/>
+      <w:r>
+        <w:t xml:space="preserve"> uniquement France = la </w:t>
+      </w:r>
+      <w:proofErr w:type="spellStart"/>
+      <w:r>
+        <w:t>collect</w:t>
+      </w:r>
+      <w:proofErr w:type="spellEnd"/>
+      <w:r>
+        <w:t xml:space="preserve"> est l’</w:t>
+      </w:r>
+      <w:proofErr w:type="spellStart"/>
+      <w:r>
+        <w:t>ecart</w:t>
+      </w:r>
+      <w:proofErr w:type="spellEnd"/>
+      <w:r>
+        <w:t xml:space="preserve"> de </w:t>
+      </w:r>
+      <w:proofErr w:type="spellStart"/>
+      <w:proofErr w:type="gramStart"/>
+      <w:r>
+        <w:t>pdf</w:t>
+      </w:r>
+      <w:proofErr w:type="spellEnd"/>
+      <w:r>
+        <w:t xml:space="preserve">  et</w:t>
+      </w:r>
+      <w:proofErr w:type="gramEnd"/>
+      <w:r>
+        <w:t xml:space="preserve"> </w:t>
+      </w:r>
+      <w:proofErr w:type="spellStart"/>
+      <w:r>
+        <w:t>excel</w:t>
+      </w:r>
+      <w:proofErr w:type="spellEnd"/>
+      <w:r>
+        <w:t xml:space="preserve"> </w:t>
+      </w:r>
+    </w:p>
+    <w:p>
+      <w:r>
+        <w:t xml:space="preserve">Mondial relai </w:t>
+      </w:r>
+      <w:proofErr w:type="gramStart"/>
+      <w:r>
+        <w:t>que en</w:t>
+      </w:r>
+      <w:proofErr w:type="gramEnd"/>
+      <w:r>
+        <w:t xml:space="preserve"> europe = tva à 0.2</w:t>
+      </w:r>
+    </w:p>
+    <w:p>
+      <w:r>
+        <w:t xml:space="preserve">Remplacer fichier import la colonne </w:t>
+      </w:r>
+      <w:proofErr w:type="spellStart"/>
+      <w:r>
+        <w:t>mode_envoi</w:t>
+      </w:r>
+      <w:proofErr w:type="spellEnd"/>
+      <w:r>
+        <w:t xml:space="preserve"> la valeur </w:t>
+      </w:r>
+      <w:r>
+        <w:t xml:space="preserve">LCC et </w:t>
+      </w:r>
+      <w:r>
+        <w:t xml:space="preserve">24RC en 24R afin d’avoir des zonne connues et pas inconnus qui causera par la suite des avaries dans l’ERP </w:t>
+      </w:r>
+    </w:p>
+    <w:p>
+      <w:r>
+        <w:t xml:space="preserve">Les fret à zeros on les supprime en verifie=ant que les autres colonnes à facturer sont aussi bien à zero </w:t>
+      </w:r>
+    </w:p>
+    <w:p/>
+    <w:p>
+      <w:r>
+        <w:t xml:space="preserve">**Colissimo </w:t>
+      </w:r>
+      <w:r>
+        <w:tab/>
+      </w:r>
+      <w:r>
+        <w:t xml:space="preserve">envoie erreur fichier mois precedent , à refaire ! </w:t>
+      </w:r>
+      <w:r>
+        <w:tab/>
+      </w:r>
+    </w:p>
+    <w:p/>
+    <w:p>
+      <w:r>
+        <w:t xml:space="preserve">** fedex :  telechargé par compta fichier csv </w:t>
+      </w:r>
+    </w:p>
+    <w:p>
+      <w:r>
+        <w:t xml:space="preserve">Tous mode d’envoi ficp c’est la merde </w:t>
+      </w:r>
+    </w:p>
+    <w:p>
+      <w:r>
+        <w:t xml:space="preserve">Voir le </w:t>
+      </w:r>
+      <w:proofErr w:type="gramStart"/>
+      <w:r>
+        <w:t>wiki ,</w:t>
+      </w:r>
+      <w:proofErr w:type="gramEnd"/>
+      <w:r>
+        <w:t xml:space="preserve"> dossier transports pour valider </w:t>
+      </w:r>
+      <w:proofErr w:type="gramStart"/>
+      <w:r>
+        <w:t>quelques notation</w:t>
+      </w:r>
+      <w:proofErr w:type="gramEnd"/>
+      <w:r>
+        <w:t xml:space="preserve"> </w:t>
+      </w:r>
+    </w:p>
+    <w:p>
+      <w:r>
+        <w:t xml:space="preserve">Convertir point en virgule pour colonne A = montant ne soit plus en #valeur </w:t>
+      </w:r>
+    </w:p>
+    <w:p>
+      <w:r>
+        <w:t xml:space="preserve">Exemple mois 07/2026 : un </w:t>
+      </w:r>
+      <w:proofErr w:type="spellStart"/>
+      <w:r>
+        <w:t>tracking</w:t>
+      </w:r>
+      <w:proofErr w:type="spellEnd"/>
+      <w:r>
+        <w:t xml:space="preserve"> daté de 11 2025 est ajouté dans le </w:t>
+      </w:r>
+      <w:proofErr w:type="spellStart"/>
+      <w:r>
+        <w:t>pdf</w:t>
+      </w:r>
+      <w:proofErr w:type="spellEnd"/>
+      <w:r>
+        <w:t xml:space="preserve"> des factures mais pas dans l’import des csv </w:t>
+      </w:r>
+    </w:p>
+    <w:p>
+      <w:r>
+        <w:t xml:space="preserve">Recherche depuis les </w:t>
+      </w:r>
+      <w:proofErr w:type="spellStart"/>
+      <w:r>
+        <w:t>pdf</w:t>
+      </w:r>
+      <w:proofErr w:type="spellEnd"/>
+      <w:r>
+        <w:t xml:space="preserve"> des factures les mots suivants et ajouter</w:t>
+      </w:r>
+      <w:r>
+        <w:t xml:space="preserve"> leur valeur </w:t>
+      </w:r>
+      <w:proofErr w:type="gramStart"/>
+      <w:r>
+        <w:t xml:space="preserve">euro </w:t>
+      </w:r>
+      <w:r>
+        <w:t xml:space="preserve"> que</w:t>
+      </w:r>
+      <w:proofErr w:type="gramEnd"/>
+      <w:r>
+        <w:t xml:space="preserve"> dans le fichier</w:t>
+      </w:r>
+      <w:r>
+        <w:t xml:space="preserve"> : </w:t>
+      </w:r>
+      <w:r>
+        <w:t xml:space="preserve">import final : </w:t>
+      </w:r>
+      <w:r>
+        <w:t>zone =&gt; zone éloignée</w:t>
+      </w:r>
+    </w:p>
+    <w:p>
+      <w:pPr>
+        <w:rPr>
+          <w:b/>
+          <w:bCs/>
+        </w:rPr>
+      </w:pPr>
+      <w:proofErr w:type="spellStart"/>
+      <w:proofErr w:type="gramStart"/>
+      <w:r>
+        <w:t>demand</w:t>
+      </w:r>
+      <w:proofErr w:type="spellEnd"/>
+      <w:proofErr w:type="gramEnd"/>
+      <w:r>
+        <w:t xml:space="preserve"> =&gt; </w:t>
+      </w:r>
+      <w:proofErr w:type="spellStart"/>
+      <w:r>
+        <w:t>plus value</w:t>
+      </w:r>
+      <w:proofErr w:type="spellEnd"/>
+      <w:r>
+        <w:t xml:space="preserve"> b2c</w:t>
+      </w:r>
+    </w:p>
+    <w:p>
+      <w:proofErr w:type="gramStart"/>
+      <w:r>
+        <w:t>plusieurs</w:t>
+      </w:r>
+      <w:proofErr w:type="gramEnd"/>
+      <w:r>
+        <w:t xml:space="preserve"> pièces =&gt; </w:t>
+      </w:r>
+      <w:proofErr w:type="spellStart"/>
+      <w:r>
+        <w:t>plus value</w:t>
+      </w:r>
+      <w:proofErr w:type="spellEnd"/>
+      <w:r>
+        <w:t xml:space="preserve"> b2c</w:t>
+      </w:r>
+    </w:p>
+    <w:p>
+      <w:r>
+        <w:lastRenderedPageBreak/>
+        <w:t>Charge pour dépassement de dimension =&gt; colis volumineux</w:t>
+      </w:r>
+    </w:p>
+    <w:p>
+      <w:r>
+        <w:t xml:space="preserve">Frais de traitement des importations aux </w:t>
+      </w:r>
+      <w:proofErr w:type="spellStart"/>
+      <w:r>
+        <w:t>États-Uni</w:t>
+      </w:r>
+      <w:proofErr w:type="spellEnd"/>
+      <w:r>
+        <w:t xml:space="preserve"> =&gt; zone éloignée</w:t>
+      </w:r>
+    </w:p>
     <w:p/>
     <w:p/>
-    <w:p/>
-    <w:p/>
-    <w:p/>
-    <w:p/>
-    <w:p/>
-    <w:p/>
+    <w:p>
+      <w:r>
+        <w:t xml:space="preserve">**Chronopost : deux factures excel envoyées </w:t>
+      </w:r>
+    </w:p>
+    <w:p>
+      <w:r>
+        <w:t xml:space="preserve">On cree un nouveau classeur , copier les info des factures , trier de A à Z les numéros de tracking  , cap = taxe gazole , eco = taxe ecp et surt= taxe sureté </w:t>
+      </w:r>
+    </w:p>
+    <w:p>
+      <w:r>
+        <w:t xml:space="preserve">Colonne AF = chaque label faire avec un tri par colonne L </w:t>
+      </w:r>
+    </w:p>
+    <w:p>
+      <w:r>
+        <w:t xml:space="preserve">Actualiser tcd poids , et tcd en supprimant les ids clients , faut tout éteindre en formule </w:t>
+      </w:r>
+    </w:p>
+    <w:p>
+      <w:r>
+        <w:t>Deux contrats : strandar</w:t>
+      </w:r>
+      <w:r>
+        <w:t>d</w:t>
+      </w:r>
+      <w:r>
+        <w:t xml:space="preserve"> et 2shop </w:t>
+      </w:r>
+    </w:p>
     <w:p/>
     <w:p/>
     <w:p/>
@@ -836,7 +1241,7 @@
 </file>
 
 <file path=word/numbering.xml><?xml version="1.0" encoding="utf-8"?>
-<w:numbering xmlns:wpc="http://schemas.microsoft.com/office/word/2010/wordprocessingCanvas" xmlns:cx="http://schemas.microsoft.com/office/drawing/2014/chartex" xmlns:cx1="http://schemas.microsoft.com/office/drawing/2015/9/8/chartex" xmlns:cx2="http://schemas.microsoft.com/office/drawing/2015/10/21/chartex" xmlns:cx3="http://schemas.microsoft.com/office/drawing/2016/5/9/chartex" xmlns:cx4="http://schemas.microsoft.com/office/drawing/2016/5/10/chartex" xmlns:cx5="http://schemas.microsoft.com/office/drawing/2016/5/11/chartex" xmlns:cx6="http://schemas.microsoft.com/office/drawing/2016/5/12/chartex" xmlns:cx7="http://schemas.microsoft.com/office/drawing/2016/5/13/chartex" xmlns:cx8="http://schemas.microsoft.com/office/drawing/2016/5/14/chartex" xmlns:mc="http://schemas.openxmlformats.org/markup-compatibility/2006" xmlns:aink="http://schemas.microsoft.com/office/drawing/2016/ink" xmlns:am3d="http://schemas.microsoft.com/office/drawing/2017/model3d" xmlns:o="urn:schemas-microsoft-com:office:office" xmlns:oel="http://schemas.microsoft.com/office/2019/extlst" xmlns:r="http://schemas.openxmlformats.org/officeDocument/2006/relationships" xmlns:m="http://schemas.openxmlformats.org/officeDocument/2006/math" xmlns:v="urn:schemas-microsoft-com:vml" xmlns:wp14="http://schemas.microsoft.com/office/word/2010/wordprocessingDrawing" xmlns:wp="http://schemas.openxmlformats.org/drawingml/2006/wordprocessingDrawing" xmlns:w10="urn:schemas-microsoft-com:office:word" xmlns:w="http://schemas.openxmlformats.org/wordprocessingml/2006/main" xmlns:w14="http://schemas.microsoft.com/office/word/2010/wordml" xmlns:w15="http://schemas.microsoft.com/office/word/2012/wordml" xmlns:w16cex="http://schemas.microsoft.com/office/word/2018/wordml/cex" xmlns:w16cid="http://schemas.microsoft.com/office/word/2016/wordml/cid" xmlns:w16="http://schemas.microsoft.com/office/word/2018/wordml" xmlns:w16du="http://schemas.microsoft.com/office/word/2023/wordml/word16du" xmlns:w16sdtdh="http://schemas.microsoft.com/office/word/2020/wordml/sdtdatahash" xmlns:w16sdtfl="http://schemas.microsoft.com/office/word/2024/wordml/sdtformatlock" xmlns:w16se="http://schemas.microsoft.com/office/word/2015/wordml/symex" xmlns:wpg="http://schemas.microsoft.com/office/word/2010/wordprocessingGroup" xmlns:wpi="http://schemas.microsoft.com/office/word/2010/wordprocessingInk" xmlns:wne="http://schemas.microsoft.com/office/word/2006/wordml" xmlns:wps="http://schemas.microsoft.com/office/word/2010/wordprocessingShape" mc:Ignorable="w14 w15 w16se w16cid w16 w16cex w16sdtdh w16sdtfl w16du wp14">
+<w:numbering xmlns:wpc="http://schemas.microsoft.com/office/word/2010/wordprocessingCanvas" xmlns:cx="http://schemas.microsoft.com/office/drawing/2014/chartex" xmlns:cx1="http://schemas.microsoft.com/office/drawing/2015/9/8/chartex" xmlns:cx2="http://schemas.microsoft.com/office/drawing/2015/10/21/chartex" xmlns:cx3="http://schemas.microsoft.com/office/drawing/2016/5/9/chartex" xmlns:cx4="http://schemas.microsoft.com/office/drawing/2016/5/10/chartex" xmlns:cx5="http://schemas.microsoft.com/office/drawing/2016/5/11/chartex" xmlns:cx6="http://schemas.microsoft.com/office/drawing/2016/5/12/chartex" xmlns:cx7="http://schemas.microsoft.com/office/drawing/2016/5/13/chartex" xmlns:cx8="http://schemas.microsoft.com/office/drawing/2016/5/14/chartex" xmlns:mc="http://schemas.openxmlformats.org/markup-compatibility/2006" xmlns:aink="http://schemas.microsoft.com/office/drawing/2016/ink" xmlns:am3d="http://schemas.microsoft.com/office/drawing/2017/model3d" xmlns:o="urn:schemas-microsoft-com:office:office" xmlns:oel="http://schemas.microsoft.com/office/2019/extlst" xmlns:r="http://schemas.openxmlformats.org/officeDocument/2006/relationships" xmlns:m="http://schemas.openxmlformats.org/officeDocument/2006/math" xmlns:v="urn:schemas-microsoft-com:vml" xmlns:wp14="http://schemas.microsoft.com/office/word/2010/wordprocessingDrawing" xmlns:wp="http://schemas.openxmlformats.org/drawingml/2006/wordprocessingDrawing" xmlns:w10="urn:schemas-microsoft-com:office:word" xmlns:w="http://schemas.openxmlformats.org/wordprocessingml/2006/main" xmlns:w14="http://schemas.microsoft.com/office/word/2010/wordml" xmlns:w15="http://schemas.microsoft.com/office/word/2012/wordml" xmlns:w16cei="http://schemas.microsoft.com/office/word/2026/wordml/cei" xmlns:w16cex="http://schemas.microsoft.com/office/word/2018/wordml/cex" xmlns:w16cid="http://schemas.microsoft.com/office/word/2016/wordml/cid" xmlns:w16="http://schemas.microsoft.com/office/word/2018/wordml" xmlns:w16du="http://schemas.microsoft.com/office/word/2023/wordml/word16du" xmlns:w16sdtdh="http://schemas.microsoft.com/office/word/2020/wordml/sdtdatahash" xmlns:w16sdtfl="http://schemas.microsoft.com/office/word/2024/wordml/sdtformatlock" xmlns:w16se="http://schemas.microsoft.com/office/word/2015/wordml/symex" xmlns:wpg="http://schemas.microsoft.com/office/word/2010/wordprocessingGroup" xmlns:wpi="http://schemas.microsoft.com/office/word/2010/wordprocessingInk" xmlns:wne="http://schemas.microsoft.com/office/word/2006/wordml" xmlns:wps="http://schemas.microsoft.com/office/word/2010/wordprocessingShape" mc:Ignorable="w14 w15 w16se w16cid w16 w16cex w16sdtdh w16sdtfl w16du wp14">
   <w:abstractNum w:abstractNumId="0" w15:restartNumberingAfterBreak="0">
     <w:nsid w:val="2DBA7E60"/>
     <w:multiLevelType w:val="hybridMultilevel"/>

</xml_diff>